<commit_message>
feat: add dynamic company logos (3 locations) and live SaaS metrics with tenant active toggle
</commit_message>
<xml_diff>
--- a/Propuesta_Comercial_Caja_Chica.docx
+++ b/Propuesta_Comercial_Caja_Chica.docx
@@ -167,13 +167,7 @@
         <w:rPr>
           <w:color w:val="BA4817"/>
         </w:rPr>
-        <w:t>2</w:t>
-      </w:r>
-      <w:r>
-        <w:rPr>
-          <w:color w:val="BA4817"/>
-        </w:rPr>
-        <w:t>. Desglose Detallado de los 3 Modelos de Presupuesto</w:t>
+        <w:t>2. Desglose Detallado de los 3 Modelos de Presupuesto</w:t>
       </w:r>
     </w:p>
     <w:p>
@@ -225,41 +219,6 @@
       </w:r>
       <w:r>
         <w:t xml:space="preserve">00 </w:t>
-      </w:r>
-      <w:r>
-        <w:t xml:space="preserve">y USD $19 </w:t>
-      </w:r>
-      <w:proofErr w:type="spellStart"/>
-      <w:r>
-        <w:t>mensual</w:t>
-      </w:r>
-      <w:proofErr w:type="spellEnd"/>
-      <w:r>
-        <w:t xml:space="preserve"> para </w:t>
-      </w:r>
-      <w:proofErr w:type="spellStart"/>
-      <w:r>
-        <w:t>soporte</w:t>
-      </w:r>
-      <w:proofErr w:type="spellEnd"/>
-      <w:r>
-        <w:t xml:space="preserve"> y </w:t>
-      </w:r>
-      <w:proofErr w:type="spellStart"/>
-      <w:r>
-        <w:t>actualizaciones</w:t>
-      </w:r>
-      <w:proofErr w:type="spellEnd"/>
-      <w:r>
-        <w:t xml:space="preserve"> de la </w:t>
-      </w:r>
-      <w:proofErr w:type="spellStart"/>
-      <w:r>
-        <w:t>aplicacion</w:t>
-      </w:r>
-      <w:proofErr w:type="spellEnd"/>
-      <w:r>
-        <w:t xml:space="preserve"> </w:t>
       </w:r>
       <w:r>
         <w:br/>
@@ -381,7 +340,31 @@
         <w:t xml:space="preserve">• Descripción: </w:t>
       </w:r>
       <w:r>
-        <w:t>Alquiler del servicio en la nube (Software as a Service). El cliente paga un canon mensual por usar la plataforma alojada y administrada por usted.</w:t>
+        <w:t xml:space="preserve">Alquiler del servicio en la nube (Software as a Service). El cliente paga un canon mensual </w:t>
+      </w:r>
+      <w:proofErr w:type="spellStart"/>
+      <w:r>
+        <w:t>por</w:t>
+      </w:r>
+      <w:proofErr w:type="spellEnd"/>
+      <w:r>
+        <w:t xml:space="preserve"> usar la </w:t>
+      </w:r>
+      <w:proofErr w:type="spellStart"/>
+      <w:r>
+        <w:t>plataforma</w:t>
+      </w:r>
+      <w:proofErr w:type="spellEnd"/>
+      <w:r>
+        <w:t xml:space="preserve"> </w:t>
+      </w:r>
+      <w:proofErr w:type="spellStart"/>
+      <w:r>
+        <w:t>alojada</w:t>
+      </w:r>
+      <w:proofErr w:type="spellEnd"/>
+      <w:r>
+        <w:t>.</w:t>
       </w:r>
       <w:r>
         <w:br/>
@@ -418,10 +401,15 @@
         <w:rPr>
           <w:b/>
         </w:rPr>
-        <w:t xml:space="preserve"> Sugerida:</w:t>
+        <w:t>:</w:t>
       </w:r>
     </w:p>
     <w:p>
+      <w:pPr>
+        <w:rPr>
+          <w:bCs/>
+        </w:rPr>
+      </w:pPr>
       <w:r>
         <w:rPr>
           <w:b/>
@@ -438,19 +426,7 @@
         <w:rPr>
           <w:b/>
         </w:rPr>
-        <w:t xml:space="preserve">Plan </w:t>
-      </w:r>
-      <w:r>
-        <w:rPr>
-          <w:b/>
-        </w:rPr>
-        <w:t>1</w:t>
-      </w:r>
-      <w:r>
-        <w:rPr>
-          <w:b/>
-        </w:rPr>
-        <w:t xml:space="preserve"> (hasta 5 </w:t>
+        <w:t xml:space="preserve">Plan 1 (hasta 5 </w:t>
       </w:r>
       <w:proofErr w:type="spellStart"/>
       <w:r>
@@ -525,25 +501,7 @@
           <w:b/>
         </w:rPr>
         <w:br/>
-        <w:t xml:space="preserve">   - </w:t>
-      </w:r>
-      <w:r>
-        <w:rPr>
-          <w:b/>
-        </w:rPr>
-        <w:t xml:space="preserve">Plan </w:t>
-      </w:r>
-      <w:r>
-        <w:rPr>
-          <w:b/>
-        </w:rPr>
-        <w:t>2</w:t>
-      </w:r>
-      <w:r>
-        <w:rPr>
-          <w:b/>
-        </w:rPr>
-        <w:t xml:space="preserve"> (hasta 10 </w:t>
+        <w:t xml:space="preserve">   - Plan 2 (hasta 10 </w:t>
       </w:r>
       <w:proofErr w:type="spellStart"/>
       <w:r>
@@ -568,26 +526,26 @@
       </w:r>
       <w:proofErr w:type="spellEnd"/>
       <w:r>
+        <w:t xml:space="preserve">. (USD $12 / </w:t>
+      </w:r>
+      <w:proofErr w:type="spellStart"/>
+      <w:r>
+        <w:t>por</w:t>
+      </w:r>
+      <w:proofErr w:type="spellEnd"/>
+      <w:r>
+        <w:t xml:space="preserve"> </w:t>
+      </w:r>
+      <w:proofErr w:type="spellStart"/>
+      <w:r>
+        <w:t>usuario</w:t>
+      </w:r>
+      <w:proofErr w:type="spellEnd"/>
+      <w:r>
+        <w:t>)</w:t>
+      </w:r>
+      <w:r>
         <w:t>.</w:t>
-      </w:r>
-      <w:r>
-        <w:t xml:space="preserve"> (USD $12 / </w:t>
-      </w:r>
-      <w:proofErr w:type="spellStart"/>
-      <w:r>
-        <w:t>por</w:t>
-      </w:r>
-      <w:proofErr w:type="spellEnd"/>
-      <w:r>
-        <w:t xml:space="preserve"> </w:t>
-      </w:r>
-      <w:proofErr w:type="spellStart"/>
-      <w:r>
-        <w:t>usuario</w:t>
-      </w:r>
-      <w:proofErr w:type="spellEnd"/>
-      <w:r>
-        <w:t>)</w:t>
       </w:r>
       <w:r>
         <w:br/>
@@ -596,13 +554,13 @@
         <w:rPr>
           <w:b/>
         </w:rPr>
-        <w:t xml:space="preserve">   - </w:t>
+        <w:t xml:space="preserve">   </w:t>
       </w:r>
       <w:r>
         <w:rPr>
           <w:b/>
         </w:rPr>
-        <w:t xml:space="preserve">Plan 3 (mas de 20 </w:t>
+        <w:t xml:space="preserve">- Plan 3 (mas de 20 </w:t>
       </w:r>
       <w:proofErr w:type="spellStart"/>
       <w:r>
@@ -648,6 +606,73 @@
       <w:proofErr w:type="spellEnd"/>
       <w:r>
         <w:rPr>
+          <w:bCs/>
+        </w:rPr>
+        <w:t>.</w:t>
+      </w:r>
+      <w:r>
+        <w:br/>
+      </w:r>
+      <w:r>
+        <w:rPr>
+          <w:b/>
+        </w:rPr>
+        <w:t xml:space="preserve">   - Plan </w:t>
+      </w:r>
+      <w:r>
+        <w:rPr>
+          <w:b/>
+        </w:rPr>
+        <w:t>4</w:t>
+      </w:r>
+      <w:r>
+        <w:rPr>
+          <w:b/>
+        </w:rPr>
+        <w:t xml:space="preserve"> (mas de </w:t>
+      </w:r>
+      <w:r>
+        <w:rPr>
+          <w:b/>
+        </w:rPr>
+        <w:t>5</w:t>
+      </w:r>
+      <w:r>
+        <w:rPr>
+          <w:b/>
+        </w:rPr>
+        <w:t xml:space="preserve">0 </w:t>
+      </w:r>
+      <w:proofErr w:type="spellStart"/>
+      <w:r>
+        <w:rPr>
+          <w:b/>
+        </w:rPr>
+        <w:t>usuarios</w:t>
+      </w:r>
+      <w:proofErr w:type="spellEnd"/>
+      <w:r>
+        <w:rPr>
+          <w:b/>
+        </w:rPr>
+        <w:t xml:space="preserve">) </w:t>
+      </w:r>
+      <w:proofErr w:type="spellStart"/>
+      <w:r>
+        <w:rPr>
+          <w:bCs/>
+        </w:rPr>
+        <w:t>negociable</w:t>
+      </w:r>
+      <w:proofErr w:type="spellEnd"/>
+      <w:r>
+        <w:rPr>
+          <w:bCs/>
+        </w:rPr>
+        <w:t>.</w:t>
+      </w:r>
+      <w:r>
+        <w:rPr>
           <w:b/>
         </w:rPr>
         <w:t xml:space="preserve"> </w:t>
@@ -696,7 +721,15 @@
         <w:br/>
       </w:r>
       <w:r>
-        <w:t xml:space="preserve">   - Acceso 24/7 a la versión Web y aplicación Android.</w:t>
+        <w:t xml:space="preserve">   - </w:t>
+      </w:r>
+      <w:proofErr w:type="spellStart"/>
+      <w:r>
+        <w:t>Acceso</w:t>
+      </w:r>
+      <w:proofErr w:type="spellEnd"/>
+      <w:r>
+        <w:t xml:space="preserve"> 24/7 a la versión Web y aplicación Android.</w:t>
       </w:r>
       <w:r>
         <w:br/>
@@ -704,11 +737,51 @@
       </w:r>
       <w:r>
         <w:br/>
-        <w:t xml:space="preserve">   - Actualizaciones continuas, copias de seguridad e infraestructura garantizada.</w:t>
+        <w:t xml:space="preserve">   - </w:t>
+      </w:r>
+      <w:proofErr w:type="spellStart"/>
+      <w:r>
+        <w:t>Actualizaciones</w:t>
+      </w:r>
+      <w:proofErr w:type="spellEnd"/>
+      <w:r>
+        <w:t xml:space="preserve"> </w:t>
+      </w:r>
+      <w:proofErr w:type="spellStart"/>
+      <w:r>
+        <w:t>continuas</w:t>
+      </w:r>
+      <w:proofErr w:type="spellEnd"/>
+      <w:r>
+        <w:t xml:space="preserve"> e </w:t>
+      </w:r>
+      <w:proofErr w:type="spellStart"/>
+      <w:r>
+        <w:t>infraestructura</w:t>
+      </w:r>
+      <w:proofErr w:type="spellEnd"/>
+      <w:r>
+        <w:t xml:space="preserve"> </w:t>
+      </w:r>
+      <w:proofErr w:type="spellStart"/>
+      <w:r>
+        <w:t>garantizada</w:t>
+      </w:r>
+      <w:proofErr w:type="spellEnd"/>
+      <w:r>
+        <w:t>.</w:t>
       </w:r>
       <w:r>
         <w:br/>
-        <w:t xml:space="preserve">   - Soporte </w:t>
+        <w:t xml:space="preserve">   - </w:t>
+      </w:r>
+      <w:proofErr w:type="spellStart"/>
+      <w:r>
+        <w:t>Soporte</w:t>
+      </w:r>
+      <w:proofErr w:type="spellEnd"/>
+      <w:r>
+        <w:t xml:space="preserve"> </w:t>
       </w:r>
       <w:proofErr w:type="spellStart"/>
       <w:r>
@@ -752,14 +825,70 @@
         <w:rPr>
           <w:b/>
         </w:rPr>
-        <w:t>• Estructura de Precios Sugerida:</w:t>
+        <w:t xml:space="preserve">• </w:t>
+      </w:r>
+      <w:proofErr w:type="spellStart"/>
+      <w:r>
+        <w:rPr>
+          <w:b/>
+        </w:rPr>
+        <w:t>Estructura</w:t>
+      </w:r>
+      <w:proofErr w:type="spellEnd"/>
+      <w:r>
+        <w:rPr>
+          <w:b/>
+        </w:rPr>
+        <w:t xml:space="preserve"> de </w:t>
+      </w:r>
+      <w:proofErr w:type="spellStart"/>
+      <w:r>
+        <w:rPr>
+          <w:b/>
+        </w:rPr>
+        <w:t>Precios</w:t>
+      </w:r>
+      <w:proofErr w:type="spellEnd"/>
+      <w:r>
+        <w:rPr>
+          <w:b/>
+        </w:rPr>
+        <w:t>:</w:t>
       </w:r>
       <w:r>
         <w:rPr>
           <w:b/>
         </w:rPr>
         <w:br/>
-        <w:t xml:space="preserve">   - Setup Inicial de Personalización e </w:t>
+        <w:t xml:space="preserve">   - Setup </w:t>
+      </w:r>
+      <w:proofErr w:type="spellStart"/>
+      <w:r>
+        <w:rPr>
+          <w:b/>
+        </w:rPr>
+        <w:t>Inicial</w:t>
+      </w:r>
+      <w:proofErr w:type="spellEnd"/>
+      <w:r>
+        <w:rPr>
+          <w:b/>
+        </w:rPr>
+        <w:t xml:space="preserve"> de </w:t>
+      </w:r>
+      <w:proofErr w:type="spellStart"/>
+      <w:r>
+        <w:rPr>
+          <w:b/>
+        </w:rPr>
+        <w:t>Personalización</w:t>
+      </w:r>
+      <w:proofErr w:type="spellEnd"/>
+      <w:r>
+        <w:rPr>
+          <w:b/>
+        </w:rPr>
+        <w:t xml:space="preserve"> e </w:t>
       </w:r>
       <w:proofErr w:type="spellStart"/>
       <w:r>
@@ -782,7 +911,13 @@
         <w:t>2</w:t>
       </w:r>
       <w:r>
-        <w:t>.500 (</w:t>
+        <w:t>.</w:t>
+      </w:r>
+      <w:r>
+        <w:t>0</w:t>
+      </w:r>
+      <w:r>
+        <w:t>00 (</w:t>
       </w:r>
       <w:proofErr w:type="spellStart"/>
       <w:r>
@@ -813,7 +948,10 @@
         <w:t>USD $</w:t>
       </w:r>
       <w:r>
-        <w:t>30</w:t>
+        <w:t>7</w:t>
+      </w:r>
+      <w:r>
+        <w:t>0</w:t>
       </w:r>
       <w:r>
         <w:t xml:space="preserve"> / </w:t>
@@ -821,6 +959,89 @@
       <w:proofErr w:type="spellStart"/>
       <w:r>
         <w:t>mes</w:t>
+      </w:r>
+      <w:proofErr w:type="spellEnd"/>
+      <w:r>
+        <w:t>.</w:t>
+      </w:r>
+      <w:r>
+        <w:t xml:space="preserve"> Este </w:t>
+      </w:r>
+      <w:proofErr w:type="spellStart"/>
+      <w:r>
+        <w:t>abono</w:t>
+      </w:r>
+      <w:proofErr w:type="spellEnd"/>
+      <w:r>
+        <w:t xml:space="preserve"> </w:t>
+      </w:r>
+      <w:proofErr w:type="spellStart"/>
+      <w:r>
+        <w:t>mensual</w:t>
+      </w:r>
+      <w:proofErr w:type="spellEnd"/>
+      <w:r>
+        <w:t xml:space="preserve"> </w:t>
+      </w:r>
+      <w:proofErr w:type="spellStart"/>
+      <w:r>
+        <w:t>puede</w:t>
+      </w:r>
+      <w:proofErr w:type="spellEnd"/>
+      <w:r>
+        <w:t xml:space="preserve"> </w:t>
+      </w:r>
+      <w:proofErr w:type="spellStart"/>
+      <w:r>
+        <w:t>aumentar</w:t>
+      </w:r>
+      <w:proofErr w:type="spellEnd"/>
+      <w:r>
+        <w:t xml:space="preserve"> </w:t>
+      </w:r>
+      <w:proofErr w:type="spellStart"/>
+      <w:r>
+        <w:t>en</w:t>
+      </w:r>
+      <w:proofErr w:type="spellEnd"/>
+      <w:r>
+        <w:t xml:space="preserve"> </w:t>
+      </w:r>
+      <w:proofErr w:type="spellStart"/>
+      <w:r>
+        <w:t>caso</w:t>
+      </w:r>
+      <w:proofErr w:type="spellEnd"/>
+      <w:r>
+        <w:t xml:space="preserve"> de ser </w:t>
+      </w:r>
+      <w:proofErr w:type="spellStart"/>
+      <w:r>
+        <w:t>necesario</w:t>
+      </w:r>
+      <w:proofErr w:type="spellEnd"/>
+      <w:r>
+        <w:t xml:space="preserve"> mas </w:t>
+      </w:r>
+      <w:proofErr w:type="spellStart"/>
+      <w:r>
+        <w:t>almacenamiento</w:t>
+      </w:r>
+      <w:proofErr w:type="spellEnd"/>
+      <w:r>
+        <w:t xml:space="preserve"> </w:t>
+      </w:r>
+      <w:proofErr w:type="spellStart"/>
+      <w:r>
+        <w:t>en</w:t>
+      </w:r>
+      <w:proofErr w:type="spellEnd"/>
+      <w:r>
+        <w:t xml:space="preserve"> la </w:t>
+      </w:r>
+      <w:proofErr w:type="spellStart"/>
+      <w:r>
+        <w:t>nube</w:t>
       </w:r>
       <w:proofErr w:type="spellEnd"/>
       <w:r>
@@ -833,7 +1054,35 @@
         <w:rPr>
           <w:b/>
         </w:rPr>
-        <w:t>• Qué Incluye:</w:t>
+        <w:t xml:space="preserve">• </w:t>
+      </w:r>
+      <w:proofErr w:type="spellStart"/>
+      <w:r>
+        <w:rPr>
+          <w:b/>
+        </w:rPr>
+        <w:t>Qué</w:t>
+      </w:r>
+      <w:proofErr w:type="spellEnd"/>
+      <w:r>
+        <w:rPr>
+          <w:b/>
+        </w:rPr>
+        <w:t xml:space="preserve"> </w:t>
+      </w:r>
+      <w:proofErr w:type="spellStart"/>
+      <w:r>
+        <w:rPr>
+          <w:b/>
+        </w:rPr>
+        <w:t>Incluye</w:t>
+      </w:r>
+      <w:proofErr w:type="spellEnd"/>
+      <w:r>
+        <w:rPr>
+          <w:b/>
+        </w:rPr>
+        <w:t>:</w:t>
       </w:r>
       <w:r>
         <w:rPr>
@@ -842,7 +1091,15 @@
         <w:br/>
       </w:r>
       <w:r>
-        <w:t xml:space="preserve">   - Configuración inicial de logo, colores de marca e importación de usuarios.</w:t>
+        <w:t xml:space="preserve">   - </w:t>
+      </w:r>
+      <w:proofErr w:type="spellStart"/>
+      <w:r>
+        <w:t>Configuración</w:t>
+      </w:r>
+      <w:proofErr w:type="spellEnd"/>
+      <w:r>
+        <w:t xml:space="preserve"> inicial de logo, colores de marca e importación de usuarios.</w:t>
       </w:r>
       <w:r>
         <w:br/>
@@ -850,9 +1107,101 @@
       </w:r>
       <w:r>
         <w:br/>
-        <w:t xml:space="preserve">   - Alojamiento de datos y regla de auto-limpieza de fotos en Google Cloud Storage.</w:t>
+        <w:t xml:space="preserve">   - Alojamiento de datos y regla de auto-</w:t>
+      </w:r>
+      <w:proofErr w:type="spellStart"/>
+      <w:r>
+        <w:t>limpieza</w:t>
+      </w:r>
+      <w:proofErr w:type="spellEnd"/>
+      <w:r>
+        <w:t xml:space="preserve"> de </w:t>
+      </w:r>
+      <w:proofErr w:type="spellStart"/>
+      <w:r>
+        <w:t>fotos</w:t>
+      </w:r>
+      <w:proofErr w:type="spellEnd"/>
+      <w:r>
+        <w:t xml:space="preserve"> </w:t>
+      </w:r>
+      <w:proofErr w:type="spellStart"/>
+      <w:r>
+        <w:t>en</w:t>
+      </w:r>
+      <w:proofErr w:type="spellEnd"/>
+      <w:r>
+        <w:t xml:space="preserve"> Google Cloud Storage.</w:t>
+      </w:r>
+      <w:r>
+        <w:br/>
+        <w:t xml:space="preserve">   </w:t>
+      </w:r>
+      <w:r>
+        <w:t xml:space="preserve">- </w:t>
+      </w:r>
+      <w:proofErr w:type="spellStart"/>
+      <w:r>
+        <w:t>Actualizaciones</w:t>
+      </w:r>
+      <w:proofErr w:type="spellEnd"/>
+      <w:r>
+        <w:t xml:space="preserve"> </w:t>
+      </w:r>
+      <w:proofErr w:type="spellStart"/>
+      <w:r>
+        <w:t>continuas</w:t>
+      </w:r>
+      <w:proofErr w:type="spellEnd"/>
+      <w:r>
+        <w:t xml:space="preserve"> e </w:t>
+      </w:r>
+      <w:proofErr w:type="spellStart"/>
+      <w:r>
+        <w:t>infraestructura</w:t>
+      </w:r>
+      <w:proofErr w:type="spellEnd"/>
+      <w:r>
+        <w:t xml:space="preserve"> </w:t>
+      </w:r>
+      <w:proofErr w:type="spellStart"/>
+      <w:r>
+        <w:t>garantizada</w:t>
+      </w:r>
+      <w:proofErr w:type="spellEnd"/>
+      <w:r>
+        <w:t>.</w:t>
+      </w:r>
+      <w:r>
+        <w:br/>
+        <w:t xml:space="preserve">   - </w:t>
+      </w:r>
+      <w:proofErr w:type="spellStart"/>
+      <w:r>
+        <w:t>Soporte</w:t>
+      </w:r>
+      <w:proofErr w:type="spellEnd"/>
+      <w:r>
+        <w:t xml:space="preserve"> </w:t>
+      </w:r>
+      <w:proofErr w:type="spellStart"/>
+      <w:r>
+        <w:t>técnico</w:t>
+      </w:r>
+      <w:proofErr w:type="spellEnd"/>
+      <w:r>
+        <w:t xml:space="preserve"> continuo </w:t>
+      </w:r>
+      <w:proofErr w:type="spellStart"/>
+      <w:r>
+        <w:t>vía</w:t>
+      </w:r>
+      <w:proofErr w:type="spellEnd"/>
+      <w:r>
+        <w:t xml:space="preserve"> email/WhatsApp.</w:t>
       </w:r>
     </w:p>
+    <w:p/>
     <w:sectPr>
       <w:pgSz w:w="12240" w:h="15840"/>
       <w:pgMar w:top="1152" w:right="1152" w:bottom="1152" w:left="1152" w:header="720" w:footer="720" w:gutter="0"/>

</xml_diff>

<commit_message>
fix: strict root URL blocking for non-superadmin, real-time suspension screen, company accordion user view, and Firebase billing resource breakdown
</commit_message>
<xml_diff>
--- a/Propuesta_Comercial_Caja_Chica.docx
+++ b/Propuesta_Comercial_Caja_Chica.docx
@@ -175,156 +175,21 @@
         <w:pStyle w:val="Ttulo2"/>
       </w:pPr>
       <w:r>
-        <w:t>OPCIÓN 1: Venta de Licencia Perpetua / Código Fuente (Llave en Mano)</w:t>
-      </w:r>
-    </w:p>
-    <w:p>
-      <w:r>
-        <w:rPr>
-          <w:b/>
-        </w:rPr>
-        <w:t xml:space="preserve">• Descripción: </w:t>
-      </w:r>
-      <w:r>
-        <w:t>Transferencia completa de los derechos de uso o código fuente del software. La aplicación se despliega directamente en las cuentas de Firebase y servidores del comprador.</w:t>
-      </w:r>
-      <w:r>
-        <w:br/>
-      </w:r>
-      <w:r>
-        <w:rPr>
-          <w:b/>
-        </w:rPr>
-        <w:t xml:space="preserve">• </w:t>
+        <w:t xml:space="preserve">OPCIÓN </w:t>
+      </w:r>
+      <w:r>
+        <w:t>1</w:t>
+      </w:r>
+      <w:r>
+        <w:t>: Modelo SaaS (</w:t>
       </w:r>
       <w:proofErr w:type="spellStart"/>
       <w:r>
-        <w:rPr>
-          <w:b/>
-        </w:rPr>
-        <w:t>Precio</w:t>
+        <w:t>Membresía</w:t>
       </w:r>
       <w:proofErr w:type="spellEnd"/>
       <w:r>
-        <w:rPr>
-          <w:b/>
-        </w:rPr>
-        <w:t xml:space="preserve">: </w:t>
-      </w:r>
-      <w:r>
-        <w:t>USD $4.</w:t>
-      </w:r>
-      <w:r>
-        <w:t>5</w:t>
-      </w:r>
-      <w:r>
-        <w:t xml:space="preserve">00 </w:t>
-      </w:r>
-      <w:r>
-        <w:br/>
-      </w:r>
-      <w:r>
-        <w:rPr>
-          <w:b/>
-        </w:rPr>
-        <w:t xml:space="preserve">• </w:t>
-      </w:r>
-      <w:proofErr w:type="spellStart"/>
-      <w:r>
-        <w:rPr>
-          <w:b/>
-        </w:rPr>
-        <w:t>Qué</w:t>
-      </w:r>
-      <w:proofErr w:type="spellEnd"/>
-      <w:r>
-        <w:rPr>
-          <w:b/>
-        </w:rPr>
-        <w:t xml:space="preserve"> </w:t>
-      </w:r>
-      <w:proofErr w:type="spellStart"/>
-      <w:r>
-        <w:rPr>
-          <w:b/>
-        </w:rPr>
-        <w:t>Incluye</w:t>
-      </w:r>
-      <w:proofErr w:type="spellEnd"/>
-      <w:r>
-        <w:rPr>
-          <w:b/>
-        </w:rPr>
-        <w:t>:</w:t>
-      </w:r>
-      <w:r>
-        <w:rPr>
-          <w:b/>
-        </w:rPr>
-        <w:br/>
-      </w:r>
-      <w:r>
-        <w:t xml:space="preserve">   - Entrega del código fuente completo en Flutter (Web, Android, iOS).</w:t>
-      </w:r>
-      <w:r>
-        <w:br/>
-        <w:t xml:space="preserve">   - Despliegue e instalación en el proyecto de Firebase del cliente.</w:t>
-      </w:r>
-      <w:r>
-        <w:br/>
-        <w:t xml:space="preserve">   - Compilación del ejecutable APK Release para dispositivos Android.</w:t>
-      </w:r>
-      <w:r>
-        <w:br/>
-        <w:t xml:space="preserve">   - </w:t>
-      </w:r>
-      <w:proofErr w:type="spellStart"/>
-      <w:r>
-        <w:t>S</w:t>
-      </w:r>
-      <w:r>
-        <w:t>oporte</w:t>
-      </w:r>
-      <w:proofErr w:type="spellEnd"/>
-      <w:r>
-        <w:t xml:space="preserve"> y </w:t>
-      </w:r>
-      <w:proofErr w:type="spellStart"/>
-      <w:r>
-        <w:t>garantía</w:t>
-      </w:r>
-      <w:proofErr w:type="spellEnd"/>
-      <w:r>
-        <w:t xml:space="preserve"> pos-</w:t>
-      </w:r>
-      <w:proofErr w:type="spellStart"/>
-      <w:r>
-        <w:t>entrega</w:t>
-      </w:r>
-      <w:proofErr w:type="spellEnd"/>
-      <w:r>
-        <w:t xml:space="preserve"> para correcciones.</w:t>
-      </w:r>
-      <w:r>
-        <w:br/>
-      </w:r>
-      <w:r>
-        <w:rPr>
-          <w:b/>
-        </w:rPr>
-        <w:t xml:space="preserve">• Infraestructura Nube: </w:t>
-      </w:r>
-      <w:r>
-        <w:t>A cargo del cliente (en Plan Gratuito Spark de Firebase los costos suelen ser $0 USD para operaciones estándar).</w:t>
-      </w:r>
-    </w:p>
-    <w:p>
-      <w:pPr>
-        <w:pStyle w:val="Ttulo2"/>
-      </w:pPr>
-      <w:r>
-        <w:lastRenderedPageBreak/>
-        <w:t>OPCIÓN 2: Modelo SaaS (Membresía Mensual / Recurrente)</w:t>
+        <w:t xml:space="preserve"> Mensual / Recurrente)</w:t>
       </w:r>
     </w:p>
     <w:p>
@@ -340,7 +205,15 @@
         <w:t xml:space="preserve">• Descripción: </w:t>
       </w:r>
       <w:r>
-        <w:t xml:space="preserve">Alquiler del servicio en la nube (Software as a Service). El cliente paga un canon mensual </w:t>
+        <w:t xml:space="preserve">Alquiler del servicio en la nube (Software as a Service). El cliente paga un canon </w:t>
+      </w:r>
+      <w:proofErr w:type="spellStart"/>
+      <w:r>
+        <w:t>mensual</w:t>
+      </w:r>
+      <w:proofErr w:type="spellEnd"/>
+      <w:r>
+        <w:t xml:space="preserve"> </w:t>
       </w:r>
       <w:proofErr w:type="spellStart"/>
       <w:r>
@@ -554,13 +427,7 @@
         <w:rPr>
           <w:b/>
         </w:rPr>
-        <w:t xml:space="preserve">   </w:t>
-      </w:r>
-      <w:r>
-        <w:rPr>
-          <w:b/>
-        </w:rPr>
-        <w:t xml:space="preserve">- Plan 3 (mas de 20 </w:t>
+        <w:t xml:space="preserve">   - Plan 3 (mas de 20 </w:t>
       </w:r>
       <w:proofErr w:type="spellStart"/>
       <w:r>
@@ -805,7 +672,30 @@
         <w:pStyle w:val="Ttulo2"/>
       </w:pPr>
       <w:r>
-        <w:t>OPCIÓN 3: Modelo Híbrido (Implementación Inicial + Abono de Mantenimiento)</w:t>
+        <w:lastRenderedPageBreak/>
+        <w:t xml:space="preserve">OPCIÓN </w:t>
+      </w:r>
+      <w:r>
+        <w:t>2</w:t>
+      </w:r>
+      <w:r>
+        <w:t xml:space="preserve">: Modelo </w:t>
+      </w:r>
+      <w:proofErr w:type="spellStart"/>
+      <w:r>
+        <w:t>Híbrido</w:t>
+      </w:r>
+      <w:proofErr w:type="spellEnd"/>
+      <w:r>
+        <w:t xml:space="preserve"> (</w:t>
+      </w:r>
+      <w:proofErr w:type="spellStart"/>
+      <w:r>
+        <w:t>Implementación</w:t>
+      </w:r>
+      <w:proofErr w:type="spellEnd"/>
+      <w:r>
+        <w:t xml:space="preserve"> Inicial + Abono de Mantenimiento)</w:t>
       </w:r>
     </w:p>
     <w:p>
@@ -1107,10 +997,18 @@
       </w:r>
       <w:r>
         <w:br/>
-        <w:t xml:space="preserve">   - Alojamiento de datos y regla de auto-</w:t>
+        <w:t xml:space="preserve">   - Alojamiento de datos y </w:t>
       </w:r>
       <w:proofErr w:type="spellStart"/>
       <w:r>
+        <w:t>regla</w:t>
+      </w:r>
+      <w:proofErr w:type="spellEnd"/>
+      <w:r>
+        <w:t xml:space="preserve"> de auto-</w:t>
+      </w:r>
+      <w:proofErr w:type="spellStart"/>
+      <w:r>
         <w:t>limpieza</w:t>
       </w:r>
       <w:proofErr w:type="spellEnd"/>
@@ -1135,10 +1033,7 @@
       </w:r>
       <w:r>
         <w:br/>
-        <w:t xml:space="preserve">   </w:t>
-      </w:r>
-      <w:r>
-        <w:t xml:space="preserve">- </w:t>
+        <w:t xml:space="preserve">   - </w:t>
       </w:r>
       <w:proofErr w:type="spellStart"/>
       <w:r>

</xml_diff>

<commit_message>
perf: ultra-light receipt image compression (max 800px, quality 65) for zero-cost Firebase storage
</commit_message>
<xml_diff>
--- a/Propuesta_Comercial_Caja_Chica.docx
+++ b/Propuesta_Comercial_Caja_Chica.docx
@@ -189,7 +189,23 @@
       </w:r>
       <w:proofErr w:type="spellEnd"/>
       <w:r>
-        <w:t xml:space="preserve"> Mensual / Recurrente)</w:t>
+        <w:t xml:space="preserve"> </w:t>
+      </w:r>
+      <w:proofErr w:type="spellStart"/>
+      <w:r>
+        <w:t>Mensual</w:t>
+      </w:r>
+      <w:proofErr w:type="spellEnd"/>
+      <w:r>
+        <w:t xml:space="preserve"> / </w:t>
+      </w:r>
+      <w:proofErr w:type="spellStart"/>
+      <w:r>
+        <w:t>Recurrente</w:t>
+      </w:r>
+      <w:proofErr w:type="spellEnd"/>
+      <w:r>
+        <w:t>)</w:t>
       </w:r>
     </w:p>
     <w:p>
@@ -205,7 +221,15 @@
         <w:t xml:space="preserve">• Descripción: </w:t>
       </w:r>
       <w:r>
-        <w:t xml:space="preserve">Alquiler del servicio en la nube (Software as a Service). El cliente paga un canon </w:t>
+        <w:t xml:space="preserve">Alquiler del servicio en la nube (Software as a Service). El cliente </w:t>
+      </w:r>
+      <w:proofErr w:type="spellStart"/>
+      <w:r>
+        <w:t>paga</w:t>
+      </w:r>
+      <w:proofErr w:type="spellEnd"/>
+      <w:r>
+        <w:t xml:space="preserve"> un canon </w:t>
       </w:r>
       <w:proofErr w:type="spellStart"/>
       <w:r>
@@ -695,7 +719,15 @@
       </w:r>
       <w:proofErr w:type="spellEnd"/>
       <w:r>
-        <w:t xml:space="preserve"> Inicial + Abono de Mantenimiento)</w:t>
+        <w:t xml:space="preserve"> </w:t>
+      </w:r>
+      <w:proofErr w:type="spellStart"/>
+      <w:r>
+        <w:t>Inicial</w:t>
+      </w:r>
+      <w:proofErr w:type="spellEnd"/>
+      <w:r>
+        <w:t xml:space="preserve"> + Abono de Mantenimiento)</w:t>
       </w:r>
     </w:p>
     <w:p>
@@ -997,7 +1029,15 @@
       </w:r>
       <w:r>
         <w:br/>
-        <w:t xml:space="preserve">   - Alojamiento de datos y </w:t>
+        <w:t xml:space="preserve">   - Alojamiento de </w:t>
+      </w:r>
+      <w:proofErr w:type="spellStart"/>
+      <w:r>
+        <w:t>datos</w:t>
+      </w:r>
+      <w:proofErr w:type="spellEnd"/>
+      <w:r>
+        <w:t xml:space="preserve"> y </w:t>
       </w:r>
       <w:proofErr w:type="spellStart"/>
       <w:r>
@@ -1095,6 +1135,1414 @@
       <w:r>
         <w:t xml:space="preserve"> email/WhatsApp.</w:t>
       </w:r>
+    </w:p>
+    <w:p/>
+    <w:p>
+      <w:pPr>
+        <w:pStyle w:val="Prrafodelista"/>
+        <w:numPr>
+          <w:ilvl w:val="0"/>
+          <w:numId w:val="11"/>
+        </w:numPr>
+        <w:rPr>
+          <w:lang w:val="es-AR"/>
+        </w:rPr>
+      </w:pPr>
+      <w:r>
+        <w:rPr>
+          <w:lang w:val="es-AR"/>
+        </w:rPr>
+        <w:t xml:space="preserve">Cuotas Gratuitas Totales de </w:t>
+      </w:r>
+      <w:proofErr w:type="spellStart"/>
+      <w:r>
+        <w:rPr>
+          <w:lang w:val="es-AR"/>
+        </w:rPr>
+        <w:t>Firebase</w:t>
+      </w:r>
+      <w:proofErr w:type="spellEnd"/>
+      <w:r>
+        <w:rPr>
+          <w:lang w:val="es-AR"/>
+        </w:rPr>
+        <w:t xml:space="preserve"> (Para todo tu proyecto)</w:t>
+      </w:r>
+    </w:p>
+    <w:tbl>
+      <w:tblPr>
+        <w:tblStyle w:val="Tablaconcuadrcula"/>
+        <w:tblW w:w="0" w:type="auto"/>
+        <w:tblLook w:val="04A0" w:firstRow="1" w:lastRow="0" w:firstColumn="1" w:lastColumn="0" w:noHBand="0" w:noVBand="1"/>
+      </w:tblPr>
+      <w:tblGrid>
+        <w:gridCol w:w="3490"/>
+        <w:gridCol w:w="3338"/>
+        <w:gridCol w:w="3324"/>
+      </w:tblGrid>
+      <w:tr>
+        <w:tc>
+          <w:tcPr>
+            <w:tcW w:w="0" w:type="auto"/>
+            <w:hideMark/>
+          </w:tcPr>
+          <w:p>
+            <w:pPr>
+              <w:spacing w:after="200" w:line="276" w:lineRule="auto"/>
+              <w:rPr>
+                <w:lang w:val="es-AR"/>
+              </w:rPr>
+            </w:pPr>
+            <w:r>
+              <w:rPr>
+                <w:lang w:val="es-AR"/>
+              </w:rPr>
+              <w:t>Servicio</w:t>
+            </w:r>
+          </w:p>
+        </w:tc>
+        <w:tc>
+          <w:tcPr>
+            <w:tcW w:w="0" w:type="auto"/>
+            <w:hideMark/>
+          </w:tcPr>
+          <w:p>
+            <w:pPr>
+              <w:spacing w:after="200" w:line="276" w:lineRule="auto"/>
+              <w:rPr>
+                <w:lang w:val="es-AR"/>
+              </w:rPr>
+            </w:pPr>
+            <w:r>
+              <w:rPr>
+                <w:lang w:val="es-AR"/>
+              </w:rPr>
+              <w:t>Límite Gratuito DIARIO</w:t>
+            </w:r>
+          </w:p>
+        </w:tc>
+        <w:tc>
+          <w:tcPr>
+            <w:tcW w:w="0" w:type="auto"/>
+            <w:hideMark/>
+          </w:tcPr>
+          <w:p>
+            <w:pPr>
+              <w:spacing w:after="200" w:line="276" w:lineRule="auto"/>
+              <w:rPr>
+                <w:lang w:val="es-AR"/>
+              </w:rPr>
+            </w:pPr>
+            <w:r>
+              <w:rPr>
+                <w:lang w:val="es-AR"/>
+              </w:rPr>
+              <w:t>Límite Gratuito MENSUAL</w:t>
+            </w:r>
+          </w:p>
+        </w:tc>
+      </w:tr>
+      <w:tr>
+        <w:tc>
+          <w:tcPr>
+            <w:tcW w:w="0" w:type="auto"/>
+            <w:hideMark/>
+          </w:tcPr>
+          <w:p>
+            <w:pPr>
+              <w:spacing w:after="200" w:line="276" w:lineRule="auto"/>
+              <w:rPr>
+                <w:lang w:val="es-AR"/>
+              </w:rPr>
+            </w:pPr>
+            <w:r>
+              <w:rPr>
+                <w:rFonts w:ascii="Segoe UI Emoji" w:hAnsi="Segoe UI Emoji" w:cs="Segoe UI Emoji"/>
+                <w:lang w:val="es-AR"/>
+              </w:rPr>
+              <w:t>📁</w:t>
+            </w:r>
+            <w:r>
+              <w:rPr>
+                <w:lang w:val="es-AR"/>
+              </w:rPr>
+              <w:t> </w:t>
+            </w:r>
+            <w:r>
+              <w:rPr>
+                <w:b/>
+                <w:bCs/>
+                <w:lang w:val="es-AR"/>
+              </w:rPr>
+              <w:t>Almacenamiento (Storage)</w:t>
+            </w:r>
+          </w:p>
+        </w:tc>
+        <w:tc>
+          <w:tcPr>
+            <w:tcW w:w="0" w:type="auto"/>
+            <w:hideMark/>
+          </w:tcPr>
+          <w:p>
+            <w:pPr>
+              <w:spacing w:after="200" w:line="276" w:lineRule="auto"/>
+              <w:rPr>
+                <w:lang w:val="es-AR"/>
+              </w:rPr>
+            </w:pPr>
+            <w:r>
+              <w:rPr>
+                <w:lang w:val="es-AR"/>
+              </w:rPr>
+              <w:t>Capacidad fija acumulada</w:t>
+            </w:r>
+          </w:p>
+        </w:tc>
+        <w:tc>
+          <w:tcPr>
+            <w:tcW w:w="0" w:type="auto"/>
+            <w:hideMark/>
+          </w:tcPr>
+          <w:p>
+            <w:pPr>
+              <w:spacing w:after="200" w:line="276" w:lineRule="auto"/>
+              <w:rPr>
+                <w:lang w:val="es-AR"/>
+              </w:rPr>
+            </w:pPr>
+            <w:r>
+              <w:rPr>
+                <w:b/>
+                <w:bCs/>
+                <w:lang w:val="es-AR"/>
+              </w:rPr>
+              <w:t>5.0 GB de disco</w:t>
+            </w:r>
+            <w:r>
+              <w:rPr>
+                <w:lang w:val="es-AR"/>
+              </w:rPr>
+              <w:t xml:space="preserve"> (~34.000 fotos de </w:t>
+            </w:r>
+            <w:proofErr w:type="gramStart"/>
+            <w:r>
+              <w:rPr>
+                <w:lang w:val="es-AR"/>
+              </w:rPr>
+              <w:t>tickets</w:t>
+            </w:r>
+            <w:proofErr w:type="gramEnd"/>
+            <w:r>
+              <w:rPr>
+                <w:lang w:val="es-AR"/>
+              </w:rPr>
+              <w:t>)</w:t>
+            </w:r>
+          </w:p>
+        </w:tc>
+      </w:tr>
+      <w:tr>
+        <w:tc>
+          <w:tcPr>
+            <w:tcW w:w="0" w:type="auto"/>
+            <w:hideMark/>
+          </w:tcPr>
+          <w:p>
+            <w:pPr>
+              <w:spacing w:after="200" w:line="276" w:lineRule="auto"/>
+              <w:rPr>
+                <w:lang w:val="es-AR"/>
+              </w:rPr>
+            </w:pPr>
+            <w:r>
+              <w:rPr>
+                <w:rFonts w:ascii="Segoe UI Emoji" w:hAnsi="Segoe UI Emoji" w:cs="Segoe UI Emoji"/>
+                <w:lang w:val="es-AR"/>
+              </w:rPr>
+              <w:t>📥</w:t>
+            </w:r>
+            <w:r>
+              <w:rPr>
+                <w:lang w:val="es-AR"/>
+              </w:rPr>
+              <w:t> </w:t>
+            </w:r>
+            <w:r>
+              <w:rPr>
+                <w:b/>
+                <w:bCs/>
+                <w:lang w:val="es-AR"/>
+              </w:rPr>
+              <w:t>Descarga de Fotos (Ancho de Banda)</w:t>
+            </w:r>
+          </w:p>
+        </w:tc>
+        <w:tc>
+          <w:tcPr>
+            <w:tcW w:w="0" w:type="auto"/>
+            <w:hideMark/>
+          </w:tcPr>
+          <w:p>
+            <w:pPr>
+              <w:spacing w:after="200" w:line="276" w:lineRule="auto"/>
+              <w:rPr>
+                <w:lang w:val="es-AR"/>
+              </w:rPr>
+            </w:pPr>
+            <w:r>
+              <w:rPr>
+                <w:b/>
+                <w:bCs/>
+                <w:lang w:val="es-AR"/>
+              </w:rPr>
+              <w:t>1.0 GB / día</w:t>
+            </w:r>
+            <w:r>
+              <w:rPr>
+                <w:lang w:val="es-AR"/>
+              </w:rPr>
+              <w:t> (~7.000 visualizaciones/día)</w:t>
+            </w:r>
+          </w:p>
+        </w:tc>
+        <w:tc>
+          <w:tcPr>
+            <w:tcW w:w="0" w:type="auto"/>
+            <w:hideMark/>
+          </w:tcPr>
+          <w:p>
+            <w:pPr>
+              <w:spacing w:after="200" w:line="276" w:lineRule="auto"/>
+              <w:rPr>
+                <w:lang w:val="es-AR"/>
+              </w:rPr>
+            </w:pPr>
+            <w:r>
+              <w:rPr>
+                <w:b/>
+                <w:bCs/>
+                <w:lang w:val="es-AR"/>
+              </w:rPr>
+              <w:t>30.0 GB / mes</w:t>
+            </w:r>
+          </w:p>
+        </w:tc>
+      </w:tr>
+      <w:tr>
+        <w:tc>
+          <w:tcPr>
+            <w:tcW w:w="0" w:type="auto"/>
+            <w:hideMark/>
+          </w:tcPr>
+          <w:p>
+            <w:pPr>
+              <w:spacing w:after="200" w:line="276" w:lineRule="auto"/>
+              <w:rPr>
+                <w:lang w:val="es-AR"/>
+              </w:rPr>
+            </w:pPr>
+            <w:r>
+              <w:rPr>
+                <w:rFonts w:ascii="Segoe UI Emoji" w:hAnsi="Segoe UI Emoji" w:cs="Segoe UI Emoji"/>
+                <w:lang w:val="es-AR"/>
+              </w:rPr>
+              <w:t>🤖</w:t>
+            </w:r>
+            <w:r>
+              <w:rPr>
+                <w:lang w:val="es-AR"/>
+              </w:rPr>
+              <w:t> </w:t>
+            </w:r>
+            <w:r>
+              <w:rPr>
+                <w:b/>
+                <w:bCs/>
+                <w:lang w:val="es-AR"/>
+              </w:rPr>
+              <w:t xml:space="preserve">Escaneos IA (OCR de </w:t>
+            </w:r>
+            <w:proofErr w:type="gramStart"/>
+            <w:r>
+              <w:rPr>
+                <w:b/>
+                <w:bCs/>
+                <w:lang w:val="es-AR"/>
+              </w:rPr>
+              <w:t>tickets</w:t>
+            </w:r>
+            <w:proofErr w:type="gramEnd"/>
+            <w:r>
+              <w:rPr>
+                <w:b/>
+                <w:bCs/>
+                <w:lang w:val="es-AR"/>
+              </w:rPr>
+              <w:t>)</w:t>
+            </w:r>
+          </w:p>
+        </w:tc>
+        <w:tc>
+          <w:tcPr>
+            <w:tcW w:w="0" w:type="auto"/>
+            <w:hideMark/>
+          </w:tcPr>
+          <w:p>
+            <w:pPr>
+              <w:spacing w:after="200" w:line="276" w:lineRule="auto"/>
+              <w:rPr>
+                <w:lang w:val="es-AR"/>
+              </w:rPr>
+            </w:pPr>
+            <w:r>
+              <w:rPr>
+                <w:lang w:val="es-AR"/>
+              </w:rPr>
+              <w:t>~33 escaneos / día</w:t>
+            </w:r>
+          </w:p>
+        </w:tc>
+        <w:tc>
+          <w:tcPr>
+            <w:tcW w:w="0" w:type="auto"/>
+            <w:hideMark/>
+          </w:tcPr>
+          <w:p>
+            <w:pPr>
+              <w:spacing w:after="200" w:line="276" w:lineRule="auto"/>
+              <w:rPr>
+                <w:lang w:val="es-AR"/>
+              </w:rPr>
+            </w:pPr>
+            <w:r>
+              <w:rPr>
+                <w:b/>
+                <w:bCs/>
+                <w:lang w:val="es-AR"/>
+              </w:rPr>
+              <w:t>1.000 escaneos / mes</w:t>
+            </w:r>
+            <w:r>
+              <w:rPr>
+                <w:lang w:val="es-AR"/>
+              </w:rPr>
+              <w:t> (Cloud Vision)</w:t>
+            </w:r>
+          </w:p>
+        </w:tc>
+      </w:tr>
+      <w:tr>
+        <w:tc>
+          <w:tcPr>
+            <w:tcW w:w="0" w:type="auto"/>
+            <w:hideMark/>
+          </w:tcPr>
+          <w:p>
+            <w:pPr>
+              <w:spacing w:after="200" w:line="276" w:lineRule="auto"/>
+              <w:rPr>
+                <w:lang w:val="es-AR"/>
+              </w:rPr>
+            </w:pPr>
+            <w:r>
+              <w:rPr>
+                <w:rFonts w:ascii="Segoe UI Emoji" w:hAnsi="Segoe UI Emoji" w:cs="Segoe UI Emoji"/>
+                <w:lang w:val="es-AR"/>
+              </w:rPr>
+              <w:t>📖</w:t>
+            </w:r>
+            <w:r>
+              <w:rPr>
+                <w:lang w:val="es-AR"/>
+              </w:rPr>
+              <w:t> </w:t>
+            </w:r>
+            <w:r>
+              <w:rPr>
+                <w:b/>
+                <w:bCs/>
+                <w:lang w:val="es-AR"/>
+              </w:rPr>
+              <w:t>Lecturas de Base de Datos (</w:t>
+            </w:r>
+            <w:proofErr w:type="spellStart"/>
+            <w:r>
+              <w:rPr>
+                <w:b/>
+                <w:bCs/>
+                <w:lang w:val="es-AR"/>
+              </w:rPr>
+              <w:t>Firestore</w:t>
+            </w:r>
+            <w:proofErr w:type="spellEnd"/>
+            <w:r>
+              <w:rPr>
+                <w:b/>
+                <w:bCs/>
+                <w:lang w:val="es-AR"/>
+              </w:rPr>
+              <w:t>)</w:t>
+            </w:r>
+          </w:p>
+        </w:tc>
+        <w:tc>
+          <w:tcPr>
+            <w:tcW w:w="0" w:type="auto"/>
+            <w:hideMark/>
+          </w:tcPr>
+          <w:p>
+            <w:pPr>
+              <w:spacing w:after="200" w:line="276" w:lineRule="auto"/>
+              <w:rPr>
+                <w:lang w:val="es-AR"/>
+              </w:rPr>
+            </w:pPr>
+            <w:r>
+              <w:rPr>
+                <w:b/>
+                <w:bCs/>
+                <w:lang w:val="es-AR"/>
+              </w:rPr>
+              <w:t>50.000 lecturas / día</w:t>
+            </w:r>
+          </w:p>
+        </w:tc>
+        <w:tc>
+          <w:tcPr>
+            <w:tcW w:w="0" w:type="auto"/>
+            <w:hideMark/>
+          </w:tcPr>
+          <w:p>
+            <w:pPr>
+              <w:spacing w:after="200" w:line="276" w:lineRule="auto"/>
+              <w:rPr>
+                <w:lang w:val="es-AR"/>
+              </w:rPr>
+            </w:pPr>
+            <w:r>
+              <w:rPr>
+                <w:b/>
+                <w:bCs/>
+                <w:lang w:val="es-AR"/>
+              </w:rPr>
+              <w:t>1.500.000 lecturas / mes</w:t>
+            </w:r>
+          </w:p>
+        </w:tc>
+      </w:tr>
+      <w:tr>
+        <w:tc>
+          <w:tcPr>
+            <w:tcW w:w="0" w:type="auto"/>
+            <w:hideMark/>
+          </w:tcPr>
+          <w:p>
+            <w:pPr>
+              <w:spacing w:after="200" w:line="276" w:lineRule="auto"/>
+              <w:rPr>
+                <w:lang w:val="es-AR"/>
+              </w:rPr>
+            </w:pPr>
+            <w:r>
+              <w:rPr>
+                <w:rFonts w:ascii="Segoe UI Emoji" w:hAnsi="Segoe UI Emoji" w:cs="Segoe UI Emoji"/>
+                <w:lang w:val="es-AR"/>
+              </w:rPr>
+              <w:t>✍️</w:t>
+            </w:r>
+            <w:r>
+              <w:rPr>
+                <w:lang w:val="es-AR"/>
+              </w:rPr>
+              <w:t> </w:t>
+            </w:r>
+            <w:r>
+              <w:rPr>
+                <w:b/>
+                <w:bCs/>
+                <w:lang w:val="es-AR"/>
+              </w:rPr>
+              <w:t>Escrituras (Cargar gastos/recargas)</w:t>
+            </w:r>
+          </w:p>
+        </w:tc>
+        <w:tc>
+          <w:tcPr>
+            <w:tcW w:w="0" w:type="auto"/>
+            <w:hideMark/>
+          </w:tcPr>
+          <w:p>
+            <w:pPr>
+              <w:spacing w:after="200" w:line="276" w:lineRule="auto"/>
+              <w:rPr>
+                <w:lang w:val="es-AR"/>
+              </w:rPr>
+            </w:pPr>
+            <w:r>
+              <w:rPr>
+                <w:b/>
+                <w:bCs/>
+                <w:lang w:val="es-AR"/>
+              </w:rPr>
+              <w:t>20.000 cargas / día</w:t>
+            </w:r>
+          </w:p>
+        </w:tc>
+        <w:tc>
+          <w:tcPr>
+            <w:tcW w:w="0" w:type="auto"/>
+            <w:hideMark/>
+          </w:tcPr>
+          <w:p>
+            <w:pPr>
+              <w:spacing w:after="200" w:line="276" w:lineRule="auto"/>
+              <w:rPr>
+                <w:lang w:val="es-AR"/>
+              </w:rPr>
+            </w:pPr>
+            <w:r>
+              <w:rPr>
+                <w:b/>
+                <w:bCs/>
+                <w:lang w:val="es-AR"/>
+              </w:rPr>
+              <w:t>600.000 cargas / mes</w:t>
+            </w:r>
+          </w:p>
+        </w:tc>
+      </w:tr>
+      <w:tr>
+        <w:tc>
+          <w:tcPr>
+            <w:tcW w:w="0" w:type="auto"/>
+            <w:hideMark/>
+          </w:tcPr>
+          <w:p>
+            <w:pPr>
+              <w:spacing w:after="200" w:line="276" w:lineRule="auto"/>
+              <w:rPr>
+                <w:lang w:val="es-AR"/>
+              </w:rPr>
+            </w:pPr>
+            <w:r>
+              <w:rPr>
+                <w:rFonts w:ascii="Segoe UI Emoji" w:hAnsi="Segoe UI Emoji" w:cs="Segoe UI Emoji"/>
+                <w:lang w:val="es-AR"/>
+              </w:rPr>
+              <w:t>👥</w:t>
+            </w:r>
+            <w:r>
+              <w:rPr>
+                <w:lang w:val="es-AR"/>
+              </w:rPr>
+              <w:t> </w:t>
+            </w:r>
+            <w:r>
+              <w:rPr>
+                <w:b/>
+                <w:bCs/>
+                <w:lang w:val="es-AR"/>
+              </w:rPr>
+              <w:t>Cuentas de Usuarios (Auth)</w:t>
+            </w:r>
+          </w:p>
+        </w:tc>
+        <w:tc>
+          <w:tcPr>
+            <w:tcW w:w="0" w:type="auto"/>
+            <w:hideMark/>
+          </w:tcPr>
+          <w:p>
+            <w:pPr>
+              <w:spacing w:after="200" w:line="276" w:lineRule="auto"/>
+              <w:rPr>
+                <w:lang w:val="es-AR"/>
+              </w:rPr>
+            </w:pPr>
+            <w:r>
+              <w:rPr>
+                <w:lang w:val="es-AR"/>
+              </w:rPr>
+              <w:t>Ilimitado</w:t>
+            </w:r>
+          </w:p>
+        </w:tc>
+        <w:tc>
+          <w:tcPr>
+            <w:tcW w:w="0" w:type="auto"/>
+            <w:hideMark/>
+          </w:tcPr>
+          <w:p>
+            <w:pPr>
+              <w:spacing w:after="200" w:line="276" w:lineRule="auto"/>
+              <w:rPr>
+                <w:lang w:val="es-AR"/>
+              </w:rPr>
+            </w:pPr>
+            <w:r>
+              <w:rPr>
+                <w:b/>
+                <w:bCs/>
+                <w:lang w:val="es-AR"/>
+              </w:rPr>
+              <w:t>Hasta 50.000 usuarios activos</w:t>
+            </w:r>
+          </w:p>
+        </w:tc>
+      </w:tr>
+    </w:tbl>
+    <w:p>
+      <w:pPr>
+        <w:rPr>
+          <w:lang w:val="es-AR"/>
+        </w:rPr>
+      </w:pPr>
+      <w:r>
+        <w:rPr>
+          <w:lang w:val="es-AR"/>
+        </w:rPr>
+        <w:pict w14:anchorId="06FF233B">
+          <v:rect id="_x0000_i1031" style="width:564pt;height:.75pt" o:hrpct="0" o:hralign="center" o:hrstd="t" o:hr="t" fillcolor="#a0a0a0" stroked="f"/>
+        </w:pict>
+      </w:r>
+    </w:p>
+    <w:p>
+      <w:pPr>
+        <w:pStyle w:val="Prrafodelista"/>
+        <w:numPr>
+          <w:ilvl w:val="0"/>
+          <w:numId w:val="11"/>
+        </w:numPr>
+        <w:rPr>
+          <w:lang w:val="es-AR"/>
+        </w:rPr>
+      </w:pPr>
+      <w:r>
+        <w:rPr>
+          <w:lang w:val="es-AR"/>
+        </w:rPr>
+        <w:t>Consumo Real por Cada Usuario en la App</w:t>
+      </w:r>
+    </w:p>
+    <w:p>
+      <w:pPr>
+        <w:ind w:firstLine="360"/>
+        <w:rPr>
+          <w:lang w:val="es-AR"/>
+        </w:rPr>
+      </w:pPr>
+      <w:r>
+        <w:rPr>
+          <w:lang w:val="es-AR"/>
+        </w:rPr>
+        <w:t xml:space="preserve">Cada vez que un usuario utiliza la </w:t>
+      </w:r>
+      <w:proofErr w:type="gramStart"/>
+      <w:r>
+        <w:rPr>
+          <w:lang w:val="es-AR"/>
+        </w:rPr>
+        <w:t>app</w:t>
+      </w:r>
+      <w:proofErr w:type="gramEnd"/>
+      <w:r>
+        <w:rPr>
+          <w:lang w:val="es-AR"/>
+        </w:rPr>
+        <w:t>, consume en promedio:</w:t>
+      </w:r>
+    </w:p>
+    <w:p>
+      <w:pPr>
+        <w:numPr>
+          <w:ilvl w:val="0"/>
+          <w:numId w:val="10"/>
+        </w:numPr>
+        <w:rPr>
+          <w:lang w:val="es-AR"/>
+        </w:rPr>
+      </w:pPr>
+      <w:r>
+        <w:rPr>
+          <w:b/>
+          <w:bCs/>
+          <w:lang w:val="es-AR"/>
+        </w:rPr>
+        <w:t>Cargar 1 gasto con foto:</w:t>
+      </w:r>
+      <w:r>
+        <w:rPr>
+          <w:lang w:val="es-AR"/>
+        </w:rPr>
+        <w:t> Ocupa </w:t>
+      </w:r>
+      <w:r>
+        <w:rPr>
+          <w:b/>
+          <w:bCs/>
+          <w:lang w:val="es-AR"/>
+        </w:rPr>
+        <w:t>~0.15 MB</w:t>
+      </w:r>
+      <w:r>
+        <w:rPr>
+          <w:lang w:val="es-AR"/>
+        </w:rPr>
+        <w:t> de disco, realiza </w:t>
+      </w:r>
+      <w:r>
+        <w:rPr>
+          <w:b/>
+          <w:bCs/>
+          <w:lang w:val="es-AR"/>
+        </w:rPr>
+        <w:t>2 escrituras</w:t>
+      </w:r>
+      <w:r>
+        <w:rPr>
+          <w:lang w:val="es-AR"/>
+        </w:rPr>
+        <w:t> y </w:t>
+      </w:r>
+      <w:r>
+        <w:rPr>
+          <w:b/>
+          <w:bCs/>
+          <w:lang w:val="es-AR"/>
+        </w:rPr>
+        <w:t>1 escaneo OCR</w:t>
+      </w:r>
+      <w:r>
+        <w:rPr>
+          <w:lang w:val="es-AR"/>
+        </w:rPr>
+        <w:t>.</w:t>
+      </w:r>
+    </w:p>
+    <w:p>
+      <w:pPr>
+        <w:numPr>
+          <w:ilvl w:val="0"/>
+          <w:numId w:val="10"/>
+        </w:numPr>
+        <w:rPr>
+          <w:lang w:val="es-AR"/>
+        </w:rPr>
+      </w:pPr>
+      <w:r>
+        <w:rPr>
+          <w:b/>
+          <w:bCs/>
+          <w:lang w:val="es-AR"/>
+        </w:rPr>
+        <w:t xml:space="preserve">Abrir la </w:t>
+      </w:r>
+      <w:proofErr w:type="gramStart"/>
+      <w:r>
+        <w:rPr>
+          <w:b/>
+          <w:bCs/>
+          <w:lang w:val="es-AR"/>
+        </w:rPr>
+        <w:t>app</w:t>
+      </w:r>
+      <w:proofErr w:type="gramEnd"/>
+      <w:r>
+        <w:rPr>
+          <w:b/>
+          <w:bCs/>
+          <w:lang w:val="es-AR"/>
+        </w:rPr>
+        <w:t xml:space="preserve"> y revisar historial:</w:t>
+      </w:r>
+      <w:r>
+        <w:rPr>
+          <w:lang w:val="es-AR"/>
+        </w:rPr>
+        <w:t> Realiza unas </w:t>
+      </w:r>
+      <w:r>
+        <w:rPr>
+          <w:b/>
+          <w:bCs/>
+          <w:lang w:val="es-AR"/>
+        </w:rPr>
+        <w:t>10 a 15 lecturas</w:t>
+      </w:r>
+      <w:r>
+        <w:rPr>
+          <w:lang w:val="es-AR"/>
+        </w:rPr>
+        <w:t xml:space="preserve"> de </w:t>
+      </w:r>
+      <w:proofErr w:type="spellStart"/>
+      <w:r>
+        <w:rPr>
+          <w:lang w:val="es-AR"/>
+        </w:rPr>
+        <w:t>Firestore</w:t>
+      </w:r>
+      <w:proofErr w:type="spellEnd"/>
+      <w:r>
+        <w:rPr>
+          <w:lang w:val="es-AR"/>
+        </w:rPr>
+        <w:t xml:space="preserve"> y descarga </w:t>
+      </w:r>
+      <w:r>
+        <w:rPr>
+          <w:b/>
+          <w:bCs/>
+          <w:lang w:val="es-AR"/>
+        </w:rPr>
+        <w:t>~0.30 MB</w:t>
+      </w:r>
+      <w:r>
+        <w:rPr>
+          <w:lang w:val="es-AR"/>
+        </w:rPr>
+        <w:t> en imágenes.</w:t>
+      </w:r>
+    </w:p>
+    <w:p>
+      <w:pPr>
+        <w:pStyle w:val="Prrafodelista"/>
+        <w:numPr>
+          <w:ilvl w:val="0"/>
+          <w:numId w:val="11"/>
+        </w:numPr>
+        <w:rPr>
+          <w:lang w:val="es-AR"/>
+        </w:rPr>
+      </w:pPr>
+    </w:p>
+    <w:p>
+      <w:pPr>
+        <w:pStyle w:val="Prrafodelista"/>
+        <w:rPr>
+          <w:lang w:val="es-AR"/>
+        </w:rPr>
+      </w:pPr>
+      <w:r>
+        <w:rPr>
+          <w:lang w:val="es-AR"/>
+        </w:rPr>
+        <w:t>A) Si una empresa tiene 5 Usuarios:</w:t>
+      </w:r>
+    </w:p>
+    <w:p>
+      <w:pPr>
+        <w:pStyle w:val="Prrafodelista"/>
+        <w:rPr>
+          <w:lang w:val="es-AR"/>
+        </w:rPr>
+      </w:pPr>
+      <w:r>
+        <w:rPr>
+          <w:b/>
+          <w:bCs/>
+          <w:lang w:val="es-AR"/>
+        </w:rPr>
+        <w:t>Escaneos IA (OCR):</w:t>
+      </w:r>
+      <w:r>
+        <w:rPr>
+          <w:lang w:val="es-AR"/>
+        </w:rPr>
+        <w:t> </w:t>
+      </w:r>
+      <w:r>
+        <w:rPr>
+          <w:b/>
+          <w:bCs/>
+          <w:lang w:val="es-AR"/>
+        </w:rPr>
+        <w:t>200 escaneos/mes por usuario</w:t>
+      </w:r>
+      <w:r>
+        <w:rPr>
+          <w:lang w:val="es-AR"/>
+        </w:rPr>
+        <w:t> (~6 a 7 comprobantes escaneados por día cada uno).</w:t>
+      </w:r>
+    </w:p>
+    <w:p>
+      <w:pPr>
+        <w:pStyle w:val="Prrafodelista"/>
+        <w:rPr>
+          <w:lang w:val="es-AR"/>
+        </w:rPr>
+      </w:pPr>
+      <w:r>
+        <w:rPr>
+          <w:b/>
+          <w:bCs/>
+          <w:lang w:val="es-AR"/>
+        </w:rPr>
+        <w:t>Almacenamiento (GB):</w:t>
+      </w:r>
+      <w:r>
+        <w:rPr>
+          <w:lang w:val="es-AR"/>
+        </w:rPr>
+        <w:t> </w:t>
+      </w:r>
+      <w:r>
+        <w:rPr>
+          <w:b/>
+          <w:bCs/>
+          <w:lang w:val="es-AR"/>
+        </w:rPr>
+        <w:t>1.0 GB por usuario</w:t>
+      </w:r>
+      <w:r>
+        <w:rPr>
+          <w:lang w:val="es-AR"/>
+        </w:rPr>
+        <w:t> (~6.800 comprobantes guardados cada uno).</w:t>
+      </w:r>
+    </w:p>
+    <w:p>
+      <w:pPr>
+        <w:pStyle w:val="Prrafodelista"/>
+        <w:rPr>
+          <w:lang w:val="es-AR"/>
+        </w:rPr>
+      </w:pPr>
+      <w:r>
+        <w:rPr>
+          <w:b/>
+          <w:bCs/>
+          <w:lang w:val="es-AR"/>
+        </w:rPr>
+        <w:t>Cargas de gastos diarias:</w:t>
+      </w:r>
+      <w:r>
+        <w:rPr>
+          <w:lang w:val="es-AR"/>
+        </w:rPr>
+        <w:t> </w:t>
+      </w:r>
+      <w:r>
+        <w:rPr>
+          <w:b/>
+          <w:bCs/>
+          <w:lang w:val="es-AR"/>
+        </w:rPr>
+        <w:t>4.000 gastos/día por usuario</w:t>
+      </w:r>
+      <w:r>
+        <w:rPr>
+          <w:lang w:val="es-AR"/>
+        </w:rPr>
+        <w:t> </w:t>
+      </w:r>
+      <w:r>
+        <w:rPr>
+          <w:i/>
+          <w:iCs/>
+          <w:lang w:val="es-AR"/>
+        </w:rPr>
+        <w:t>(Prácticamente imposible de superar)</w:t>
+      </w:r>
+      <w:r>
+        <w:rPr>
+          <w:lang w:val="es-AR"/>
+        </w:rPr>
+        <w:t>.</w:t>
+      </w:r>
+    </w:p>
+    <w:p>
+      <w:pPr>
+        <w:pStyle w:val="Prrafodelista"/>
+        <w:rPr>
+          <w:lang w:val="es-AR"/>
+        </w:rPr>
+      </w:pPr>
+      <w:r>
+        <w:rPr>
+          <w:b/>
+          <w:bCs/>
+          <w:lang w:val="es-AR"/>
+        </w:rPr>
+        <w:t>Consultas/Lecturas diarias:</w:t>
+      </w:r>
+      <w:r>
+        <w:rPr>
+          <w:lang w:val="es-AR"/>
+        </w:rPr>
+        <w:t> </w:t>
+      </w:r>
+      <w:r>
+        <w:rPr>
+          <w:b/>
+          <w:bCs/>
+          <w:lang w:val="es-AR"/>
+        </w:rPr>
+        <w:t>10.000 lecturas/día por usuario</w:t>
+      </w:r>
+      <w:r>
+        <w:rPr>
+          <w:lang w:val="es-AR"/>
+        </w:rPr>
+        <w:t>.</w:t>
+      </w:r>
+    </w:p>
+    <w:p>
+      <w:pPr>
+        <w:pStyle w:val="Prrafodelista"/>
+        <w:rPr>
+          <w:lang w:val="es-AR"/>
+        </w:rPr>
+      </w:pPr>
+      <w:r>
+        <w:rPr>
+          <w:lang w:val="es-AR"/>
+        </w:rPr>
+        <w:pict w14:anchorId="59D99B2A">
+          <v:rect id="_x0000_i1045" style="width:564pt;height:.75pt" o:hrpct="0" o:hralign="center" o:hrstd="t" o:hr="t" fillcolor="#a0a0a0" stroked="f"/>
+        </w:pict>
+      </w:r>
+    </w:p>
+    <w:p>
+      <w:pPr>
+        <w:pStyle w:val="Prrafodelista"/>
+        <w:rPr>
+          <w:lang w:val="es-AR"/>
+        </w:rPr>
+      </w:pPr>
+      <w:r>
+        <w:rPr>
+          <w:lang w:val="es-AR"/>
+        </w:rPr>
+        <w:t>B) Si una empresa tiene 10 Usuarios:</w:t>
+      </w:r>
+    </w:p>
+    <w:p>
+      <w:pPr>
+        <w:pStyle w:val="Prrafodelista"/>
+        <w:rPr>
+          <w:lang w:val="es-AR"/>
+        </w:rPr>
+      </w:pPr>
+      <w:r>
+        <w:rPr>
+          <w:b/>
+          <w:bCs/>
+          <w:lang w:val="es-AR"/>
+        </w:rPr>
+        <w:t>Escaneos IA (OCR):</w:t>
+      </w:r>
+      <w:r>
+        <w:rPr>
+          <w:lang w:val="es-AR"/>
+        </w:rPr>
+        <w:t> </w:t>
+      </w:r>
+      <w:r>
+        <w:rPr>
+          <w:b/>
+          <w:bCs/>
+          <w:lang w:val="es-AR"/>
+        </w:rPr>
+        <w:t>100 escaneos/mes por usuario</w:t>
+      </w:r>
+      <w:r>
+        <w:rPr>
+          <w:lang w:val="es-AR"/>
+        </w:rPr>
+        <w:t> (~3 a 4 comprobantes escaneados por día cada uno).</w:t>
+      </w:r>
+    </w:p>
+    <w:p>
+      <w:pPr>
+        <w:pStyle w:val="Prrafodelista"/>
+        <w:rPr>
+          <w:lang w:val="es-AR"/>
+        </w:rPr>
+      </w:pPr>
+      <w:r>
+        <w:rPr>
+          <w:b/>
+          <w:bCs/>
+          <w:lang w:val="es-AR"/>
+        </w:rPr>
+        <w:t>Almacenamiento (GB):</w:t>
+      </w:r>
+      <w:r>
+        <w:rPr>
+          <w:lang w:val="es-AR"/>
+        </w:rPr>
+        <w:t> </w:t>
+      </w:r>
+      <w:r>
+        <w:rPr>
+          <w:b/>
+          <w:bCs/>
+          <w:lang w:val="es-AR"/>
+        </w:rPr>
+        <w:t>0.5 GB (500 MB) por usuario</w:t>
+      </w:r>
+      <w:r>
+        <w:rPr>
+          <w:lang w:val="es-AR"/>
+        </w:rPr>
+        <w:t> (~3.400 comprobantes guardados cada uno).</w:t>
+      </w:r>
+    </w:p>
+    <w:p>
+      <w:pPr>
+        <w:pStyle w:val="Prrafodelista"/>
+        <w:rPr>
+          <w:lang w:val="es-AR"/>
+        </w:rPr>
+      </w:pPr>
+      <w:r>
+        <w:rPr>
+          <w:b/>
+          <w:bCs/>
+          <w:lang w:val="es-AR"/>
+        </w:rPr>
+        <w:t>Cargas de gastos diarias:</w:t>
+      </w:r>
+      <w:r>
+        <w:rPr>
+          <w:lang w:val="es-AR"/>
+        </w:rPr>
+        <w:t> </w:t>
+      </w:r>
+      <w:r>
+        <w:rPr>
+          <w:b/>
+          <w:bCs/>
+          <w:lang w:val="es-AR"/>
+        </w:rPr>
+        <w:t>2.000 gastos/día por usuario</w:t>
+      </w:r>
+      <w:r>
+        <w:rPr>
+          <w:lang w:val="es-AR"/>
+        </w:rPr>
+        <w:t>.</w:t>
+      </w:r>
+    </w:p>
+    <w:p>
+      <w:pPr>
+        <w:pStyle w:val="Prrafodelista"/>
+        <w:rPr>
+          <w:lang w:val="es-AR"/>
+        </w:rPr>
+      </w:pPr>
+      <w:r>
+        <w:rPr>
+          <w:b/>
+          <w:bCs/>
+          <w:lang w:val="es-AR"/>
+        </w:rPr>
+        <w:t>Consultas/Lecturas diarias:</w:t>
+      </w:r>
+      <w:r>
+        <w:rPr>
+          <w:lang w:val="es-AR"/>
+        </w:rPr>
+        <w:t> </w:t>
+      </w:r>
+      <w:r>
+        <w:rPr>
+          <w:b/>
+          <w:bCs/>
+          <w:lang w:val="es-AR"/>
+        </w:rPr>
+        <w:t>5.000 lecturas/día por usuario</w:t>
+      </w:r>
+      <w:r>
+        <w:rPr>
+          <w:lang w:val="es-AR"/>
+        </w:rPr>
+        <w:t>.</w:t>
+      </w:r>
+    </w:p>
+    <w:p>
+      <w:pPr>
+        <w:pStyle w:val="Prrafodelista"/>
+        <w:rPr>
+          <w:lang w:val="es-AR"/>
+        </w:rPr>
+      </w:pPr>
+      <w:r>
+        <w:rPr>
+          <w:lang w:val="es-AR"/>
+        </w:rPr>
+        <w:pict w14:anchorId="0C228A0E">
+          <v:rect id="_x0000_i1046" style="width:564pt;height:.75pt" o:hrpct="0" o:hralign="center" o:hrstd="t" o:hr="t" fillcolor="#a0a0a0" stroked="f"/>
+        </w:pict>
+      </w:r>
+    </w:p>
+    <w:p>
+      <w:pPr>
+        <w:pStyle w:val="Prrafodelista"/>
+        <w:rPr>
+          <w:lang w:val="es-AR"/>
+        </w:rPr>
+      </w:pPr>
+      <w:r>
+        <w:rPr>
+          <w:lang w:val="es-AR"/>
+        </w:rPr>
+        <w:t>C) Si una empresa tiene 20 Usuarios:</w:t>
+      </w:r>
+    </w:p>
+    <w:p>
+      <w:pPr>
+        <w:pStyle w:val="Prrafodelista"/>
+        <w:rPr>
+          <w:lang w:val="es-AR"/>
+        </w:rPr>
+      </w:pPr>
+      <w:r>
+        <w:rPr>
+          <w:b/>
+          <w:bCs/>
+          <w:lang w:val="es-AR"/>
+        </w:rPr>
+        <w:t>Escaneos IA (OCR):</w:t>
+      </w:r>
+      <w:r>
+        <w:rPr>
+          <w:lang w:val="es-AR"/>
+        </w:rPr>
+        <w:t> </w:t>
+      </w:r>
+      <w:r>
+        <w:rPr>
+          <w:b/>
+          <w:bCs/>
+          <w:lang w:val="es-AR"/>
+        </w:rPr>
+        <w:t>50 escaneos/mes por usuario</w:t>
+      </w:r>
+      <w:r>
+        <w:rPr>
+          <w:lang w:val="es-AR"/>
+        </w:rPr>
+        <w:t> (~1 a 2 comprobantes diarios cada uno).</w:t>
+      </w:r>
+    </w:p>
+    <w:p>
+      <w:pPr>
+        <w:pStyle w:val="Prrafodelista"/>
+        <w:rPr>
+          <w:lang w:val="es-AR"/>
+        </w:rPr>
+      </w:pPr>
+      <w:r>
+        <w:rPr>
+          <w:b/>
+          <w:bCs/>
+          <w:lang w:val="es-AR"/>
+        </w:rPr>
+        <w:t>Almacenamiento (GB):</w:t>
+      </w:r>
+      <w:r>
+        <w:rPr>
+          <w:lang w:val="es-AR"/>
+        </w:rPr>
+        <w:t> </w:t>
+      </w:r>
+      <w:r>
+        <w:rPr>
+          <w:b/>
+          <w:bCs/>
+          <w:lang w:val="es-AR"/>
+        </w:rPr>
+        <w:t>250 MB por usuario</w:t>
+      </w:r>
+      <w:r>
+        <w:rPr>
+          <w:lang w:val="es-AR"/>
+        </w:rPr>
+        <w:t> (~1.700 comprobantes con foto cada uno).</w:t>
+      </w:r>
+    </w:p>
+    <w:p>
+      <w:pPr>
+        <w:pStyle w:val="Prrafodelista"/>
+        <w:rPr>
+          <w:lang w:val="es-AR"/>
+        </w:rPr>
+      </w:pPr>
+      <w:r>
+        <w:rPr>
+          <w:b/>
+          <w:bCs/>
+          <w:lang w:val="es-AR"/>
+        </w:rPr>
+        <w:t>Cargas de gastos diarias:</w:t>
+      </w:r>
+      <w:r>
+        <w:rPr>
+          <w:lang w:val="es-AR"/>
+        </w:rPr>
+        <w:t> </w:t>
+      </w:r>
+      <w:r>
+        <w:rPr>
+          <w:b/>
+          <w:bCs/>
+          <w:lang w:val="es-AR"/>
+        </w:rPr>
+        <w:t>1.000 gastos/día por usuario</w:t>
+      </w:r>
+      <w:r>
+        <w:rPr>
+          <w:lang w:val="es-AR"/>
+        </w:rPr>
+        <w:t>.</w:t>
+      </w:r>
+    </w:p>
+    <w:p>
+      <w:pPr>
+        <w:pStyle w:val="Prrafodelista"/>
+        <w:rPr>
+          <w:lang w:val="es-AR"/>
+        </w:rPr>
+      </w:pPr>
+      <w:r>
+        <w:rPr>
+          <w:b/>
+          <w:bCs/>
+          <w:lang w:val="es-AR"/>
+        </w:rPr>
+        <w:t>Consultas/Lecturas diarias:</w:t>
+      </w:r>
+      <w:r>
+        <w:rPr>
+          <w:lang w:val="es-AR"/>
+        </w:rPr>
+        <w:t> </w:t>
+      </w:r>
+      <w:r>
+        <w:rPr>
+          <w:b/>
+          <w:bCs/>
+          <w:lang w:val="es-AR"/>
+        </w:rPr>
+        <w:t>2.500 lecturas/día por usuario</w:t>
+      </w:r>
+      <w:r>
+        <w:rPr>
+          <w:lang w:val="es-AR"/>
+        </w:rPr>
+        <w:t>.</w:t>
+      </w:r>
+    </w:p>
+    <w:p>
+      <w:pPr>
+        <w:pStyle w:val="Prrafodelista"/>
+        <w:rPr>
+          <w:lang w:val="es-AR"/>
+        </w:rPr>
+      </w:pPr>
     </w:p>
     <w:p/>
     <w:sectPr>
@@ -1277,6 +2725,691 @@
       </w:pPr>
       <w:rPr>
         <w:rFonts w:ascii="Symbol" w:hAnsi="Symbol" w:hint="default"/>
+      </w:rPr>
+    </w:lvl>
+  </w:abstractNum>
+  <w:abstractNum w:abstractNumId="9" w15:restartNumberingAfterBreak="0">
+    <w:nsid w:val="0C5E1707"/>
+    <w:multiLevelType w:val="hybridMultilevel"/>
+    <w:tmpl w:val="C6CCFF62"/>
+    <w:lvl w:ilvl="0" w:tplc="2C0A000F">
+      <w:start w:val="1"/>
+      <w:numFmt w:val="decimal"/>
+      <w:lvlText w:val="%1."/>
+      <w:lvlJc w:val="left"/>
+      <w:pPr>
+        <w:ind w:left="720" w:hanging="360"/>
+      </w:pPr>
+      <w:rPr>
+        <w:rFonts w:hint="default"/>
+      </w:rPr>
+    </w:lvl>
+    <w:lvl w:ilvl="1" w:tplc="2C0A0019" w:tentative="1">
+      <w:start w:val="1"/>
+      <w:numFmt w:val="lowerLetter"/>
+      <w:lvlText w:val="%2."/>
+      <w:lvlJc w:val="left"/>
+      <w:pPr>
+        <w:ind w:left="1440" w:hanging="360"/>
+      </w:pPr>
+    </w:lvl>
+    <w:lvl w:ilvl="2" w:tplc="2C0A001B" w:tentative="1">
+      <w:start w:val="1"/>
+      <w:numFmt w:val="lowerRoman"/>
+      <w:lvlText w:val="%3."/>
+      <w:lvlJc w:val="right"/>
+      <w:pPr>
+        <w:ind w:left="2160" w:hanging="180"/>
+      </w:pPr>
+    </w:lvl>
+    <w:lvl w:ilvl="3" w:tplc="2C0A000F" w:tentative="1">
+      <w:start w:val="1"/>
+      <w:numFmt w:val="decimal"/>
+      <w:lvlText w:val="%4."/>
+      <w:lvlJc w:val="left"/>
+      <w:pPr>
+        <w:ind w:left="2880" w:hanging="360"/>
+      </w:pPr>
+    </w:lvl>
+    <w:lvl w:ilvl="4" w:tplc="2C0A0019" w:tentative="1">
+      <w:start w:val="1"/>
+      <w:numFmt w:val="lowerLetter"/>
+      <w:lvlText w:val="%5."/>
+      <w:lvlJc w:val="left"/>
+      <w:pPr>
+        <w:ind w:left="3600" w:hanging="360"/>
+      </w:pPr>
+    </w:lvl>
+    <w:lvl w:ilvl="5" w:tplc="2C0A001B" w:tentative="1">
+      <w:start w:val="1"/>
+      <w:numFmt w:val="lowerRoman"/>
+      <w:lvlText w:val="%6."/>
+      <w:lvlJc w:val="right"/>
+      <w:pPr>
+        <w:ind w:left="4320" w:hanging="180"/>
+      </w:pPr>
+    </w:lvl>
+    <w:lvl w:ilvl="6" w:tplc="2C0A000F" w:tentative="1">
+      <w:start w:val="1"/>
+      <w:numFmt w:val="decimal"/>
+      <w:lvlText w:val="%7."/>
+      <w:lvlJc w:val="left"/>
+      <w:pPr>
+        <w:ind w:left="5040" w:hanging="360"/>
+      </w:pPr>
+    </w:lvl>
+    <w:lvl w:ilvl="7" w:tplc="2C0A0019" w:tentative="1">
+      <w:start w:val="1"/>
+      <w:numFmt w:val="lowerLetter"/>
+      <w:lvlText w:val="%8."/>
+      <w:lvlJc w:val="left"/>
+      <w:pPr>
+        <w:ind w:left="5760" w:hanging="360"/>
+      </w:pPr>
+    </w:lvl>
+    <w:lvl w:ilvl="8" w:tplc="2C0A001B" w:tentative="1">
+      <w:start w:val="1"/>
+      <w:numFmt w:val="lowerRoman"/>
+      <w:lvlText w:val="%9."/>
+      <w:lvlJc w:val="right"/>
+      <w:pPr>
+        <w:ind w:left="6480" w:hanging="180"/>
+      </w:pPr>
+    </w:lvl>
+  </w:abstractNum>
+  <w:abstractNum w:abstractNumId="10" w15:restartNumberingAfterBreak="0">
+    <w:nsid w:val="39646ECF"/>
+    <w:multiLevelType w:val="multilevel"/>
+    <w:tmpl w:val="8772B7E2"/>
+    <w:lvl w:ilvl="0">
+      <w:start w:val="1"/>
+      <w:numFmt w:val="bullet"/>
+      <w:lvlText w:val=""/>
+      <w:lvlJc w:val="left"/>
+      <w:pPr>
+        <w:tabs>
+          <w:tab w:val="num" w:pos="720"/>
+        </w:tabs>
+        <w:ind w:left="720" w:hanging="360"/>
+      </w:pPr>
+      <w:rPr>
+        <w:rFonts w:ascii="Symbol" w:hAnsi="Symbol" w:hint="default"/>
+        <w:sz w:val="20"/>
+      </w:rPr>
+    </w:lvl>
+    <w:lvl w:ilvl="1" w:tentative="1">
+      <w:start w:val="1"/>
+      <w:numFmt w:val="bullet"/>
+      <w:lvlText w:val=""/>
+      <w:lvlJc w:val="left"/>
+      <w:pPr>
+        <w:tabs>
+          <w:tab w:val="num" w:pos="1440"/>
+        </w:tabs>
+        <w:ind w:left="1440" w:hanging="360"/>
+      </w:pPr>
+      <w:rPr>
+        <w:rFonts w:ascii="Symbol" w:hAnsi="Symbol" w:hint="default"/>
+        <w:sz w:val="20"/>
+      </w:rPr>
+    </w:lvl>
+    <w:lvl w:ilvl="2" w:tentative="1">
+      <w:start w:val="1"/>
+      <w:numFmt w:val="bullet"/>
+      <w:lvlText w:val=""/>
+      <w:lvlJc w:val="left"/>
+      <w:pPr>
+        <w:tabs>
+          <w:tab w:val="num" w:pos="2160"/>
+        </w:tabs>
+        <w:ind w:left="2160" w:hanging="360"/>
+      </w:pPr>
+      <w:rPr>
+        <w:rFonts w:ascii="Symbol" w:hAnsi="Symbol" w:hint="default"/>
+        <w:sz w:val="20"/>
+      </w:rPr>
+    </w:lvl>
+    <w:lvl w:ilvl="3" w:tentative="1">
+      <w:start w:val="1"/>
+      <w:numFmt w:val="bullet"/>
+      <w:lvlText w:val=""/>
+      <w:lvlJc w:val="left"/>
+      <w:pPr>
+        <w:tabs>
+          <w:tab w:val="num" w:pos="2880"/>
+        </w:tabs>
+        <w:ind w:left="2880" w:hanging="360"/>
+      </w:pPr>
+      <w:rPr>
+        <w:rFonts w:ascii="Symbol" w:hAnsi="Symbol" w:hint="default"/>
+        <w:sz w:val="20"/>
+      </w:rPr>
+    </w:lvl>
+    <w:lvl w:ilvl="4" w:tentative="1">
+      <w:start w:val="1"/>
+      <w:numFmt w:val="bullet"/>
+      <w:lvlText w:val=""/>
+      <w:lvlJc w:val="left"/>
+      <w:pPr>
+        <w:tabs>
+          <w:tab w:val="num" w:pos="3600"/>
+        </w:tabs>
+        <w:ind w:left="3600" w:hanging="360"/>
+      </w:pPr>
+      <w:rPr>
+        <w:rFonts w:ascii="Symbol" w:hAnsi="Symbol" w:hint="default"/>
+        <w:sz w:val="20"/>
+      </w:rPr>
+    </w:lvl>
+    <w:lvl w:ilvl="5" w:tentative="1">
+      <w:start w:val="1"/>
+      <w:numFmt w:val="bullet"/>
+      <w:lvlText w:val=""/>
+      <w:lvlJc w:val="left"/>
+      <w:pPr>
+        <w:tabs>
+          <w:tab w:val="num" w:pos="4320"/>
+        </w:tabs>
+        <w:ind w:left="4320" w:hanging="360"/>
+      </w:pPr>
+      <w:rPr>
+        <w:rFonts w:ascii="Symbol" w:hAnsi="Symbol" w:hint="default"/>
+        <w:sz w:val="20"/>
+      </w:rPr>
+    </w:lvl>
+    <w:lvl w:ilvl="6" w:tentative="1">
+      <w:start w:val="1"/>
+      <w:numFmt w:val="bullet"/>
+      <w:lvlText w:val=""/>
+      <w:lvlJc w:val="left"/>
+      <w:pPr>
+        <w:tabs>
+          <w:tab w:val="num" w:pos="5040"/>
+        </w:tabs>
+        <w:ind w:left="5040" w:hanging="360"/>
+      </w:pPr>
+      <w:rPr>
+        <w:rFonts w:ascii="Symbol" w:hAnsi="Symbol" w:hint="default"/>
+        <w:sz w:val="20"/>
+      </w:rPr>
+    </w:lvl>
+    <w:lvl w:ilvl="7" w:tentative="1">
+      <w:start w:val="1"/>
+      <w:numFmt w:val="bullet"/>
+      <w:lvlText w:val=""/>
+      <w:lvlJc w:val="left"/>
+      <w:pPr>
+        <w:tabs>
+          <w:tab w:val="num" w:pos="5760"/>
+        </w:tabs>
+        <w:ind w:left="5760" w:hanging="360"/>
+      </w:pPr>
+      <w:rPr>
+        <w:rFonts w:ascii="Symbol" w:hAnsi="Symbol" w:hint="default"/>
+        <w:sz w:val="20"/>
+      </w:rPr>
+    </w:lvl>
+    <w:lvl w:ilvl="8" w:tentative="1">
+      <w:start w:val="1"/>
+      <w:numFmt w:val="bullet"/>
+      <w:lvlText w:val=""/>
+      <w:lvlJc w:val="left"/>
+      <w:pPr>
+        <w:tabs>
+          <w:tab w:val="num" w:pos="6480"/>
+        </w:tabs>
+        <w:ind w:left="6480" w:hanging="360"/>
+      </w:pPr>
+      <w:rPr>
+        <w:rFonts w:ascii="Symbol" w:hAnsi="Symbol" w:hint="default"/>
+        <w:sz w:val="20"/>
+      </w:rPr>
+    </w:lvl>
+  </w:abstractNum>
+  <w:abstractNum w:abstractNumId="11" w15:restartNumberingAfterBreak="0">
+    <w:nsid w:val="5B99452A"/>
+    <w:multiLevelType w:val="multilevel"/>
+    <w:tmpl w:val="3BD82B02"/>
+    <w:lvl w:ilvl="0">
+      <w:start w:val="1"/>
+      <w:numFmt w:val="bullet"/>
+      <w:lvlText w:val=""/>
+      <w:lvlJc w:val="left"/>
+      <w:pPr>
+        <w:tabs>
+          <w:tab w:val="num" w:pos="720"/>
+        </w:tabs>
+        <w:ind w:left="720" w:hanging="360"/>
+      </w:pPr>
+      <w:rPr>
+        <w:rFonts w:ascii="Symbol" w:hAnsi="Symbol" w:hint="default"/>
+        <w:sz w:val="20"/>
+      </w:rPr>
+    </w:lvl>
+    <w:lvl w:ilvl="1" w:tentative="1">
+      <w:start w:val="1"/>
+      <w:numFmt w:val="bullet"/>
+      <w:lvlText w:val=""/>
+      <w:lvlJc w:val="left"/>
+      <w:pPr>
+        <w:tabs>
+          <w:tab w:val="num" w:pos="1440"/>
+        </w:tabs>
+        <w:ind w:left="1440" w:hanging="360"/>
+      </w:pPr>
+      <w:rPr>
+        <w:rFonts w:ascii="Symbol" w:hAnsi="Symbol" w:hint="default"/>
+        <w:sz w:val="20"/>
+      </w:rPr>
+    </w:lvl>
+    <w:lvl w:ilvl="2" w:tentative="1">
+      <w:start w:val="1"/>
+      <w:numFmt w:val="bullet"/>
+      <w:lvlText w:val=""/>
+      <w:lvlJc w:val="left"/>
+      <w:pPr>
+        <w:tabs>
+          <w:tab w:val="num" w:pos="2160"/>
+        </w:tabs>
+        <w:ind w:left="2160" w:hanging="360"/>
+      </w:pPr>
+      <w:rPr>
+        <w:rFonts w:ascii="Symbol" w:hAnsi="Symbol" w:hint="default"/>
+        <w:sz w:val="20"/>
+      </w:rPr>
+    </w:lvl>
+    <w:lvl w:ilvl="3" w:tentative="1">
+      <w:start w:val="1"/>
+      <w:numFmt w:val="bullet"/>
+      <w:lvlText w:val=""/>
+      <w:lvlJc w:val="left"/>
+      <w:pPr>
+        <w:tabs>
+          <w:tab w:val="num" w:pos="2880"/>
+        </w:tabs>
+        <w:ind w:left="2880" w:hanging="360"/>
+      </w:pPr>
+      <w:rPr>
+        <w:rFonts w:ascii="Symbol" w:hAnsi="Symbol" w:hint="default"/>
+        <w:sz w:val="20"/>
+      </w:rPr>
+    </w:lvl>
+    <w:lvl w:ilvl="4" w:tentative="1">
+      <w:start w:val="1"/>
+      <w:numFmt w:val="bullet"/>
+      <w:lvlText w:val=""/>
+      <w:lvlJc w:val="left"/>
+      <w:pPr>
+        <w:tabs>
+          <w:tab w:val="num" w:pos="3600"/>
+        </w:tabs>
+        <w:ind w:left="3600" w:hanging="360"/>
+      </w:pPr>
+      <w:rPr>
+        <w:rFonts w:ascii="Symbol" w:hAnsi="Symbol" w:hint="default"/>
+        <w:sz w:val="20"/>
+      </w:rPr>
+    </w:lvl>
+    <w:lvl w:ilvl="5" w:tentative="1">
+      <w:start w:val="1"/>
+      <w:numFmt w:val="bullet"/>
+      <w:lvlText w:val=""/>
+      <w:lvlJc w:val="left"/>
+      <w:pPr>
+        <w:tabs>
+          <w:tab w:val="num" w:pos="4320"/>
+        </w:tabs>
+        <w:ind w:left="4320" w:hanging="360"/>
+      </w:pPr>
+      <w:rPr>
+        <w:rFonts w:ascii="Symbol" w:hAnsi="Symbol" w:hint="default"/>
+        <w:sz w:val="20"/>
+      </w:rPr>
+    </w:lvl>
+    <w:lvl w:ilvl="6" w:tentative="1">
+      <w:start w:val="1"/>
+      <w:numFmt w:val="bullet"/>
+      <w:lvlText w:val=""/>
+      <w:lvlJc w:val="left"/>
+      <w:pPr>
+        <w:tabs>
+          <w:tab w:val="num" w:pos="5040"/>
+        </w:tabs>
+        <w:ind w:left="5040" w:hanging="360"/>
+      </w:pPr>
+      <w:rPr>
+        <w:rFonts w:ascii="Symbol" w:hAnsi="Symbol" w:hint="default"/>
+        <w:sz w:val="20"/>
+      </w:rPr>
+    </w:lvl>
+    <w:lvl w:ilvl="7" w:tentative="1">
+      <w:start w:val="1"/>
+      <w:numFmt w:val="bullet"/>
+      <w:lvlText w:val=""/>
+      <w:lvlJc w:val="left"/>
+      <w:pPr>
+        <w:tabs>
+          <w:tab w:val="num" w:pos="5760"/>
+        </w:tabs>
+        <w:ind w:left="5760" w:hanging="360"/>
+      </w:pPr>
+      <w:rPr>
+        <w:rFonts w:ascii="Symbol" w:hAnsi="Symbol" w:hint="default"/>
+        <w:sz w:val="20"/>
+      </w:rPr>
+    </w:lvl>
+    <w:lvl w:ilvl="8" w:tentative="1">
+      <w:start w:val="1"/>
+      <w:numFmt w:val="bullet"/>
+      <w:lvlText w:val=""/>
+      <w:lvlJc w:val="left"/>
+      <w:pPr>
+        <w:tabs>
+          <w:tab w:val="num" w:pos="6480"/>
+        </w:tabs>
+        <w:ind w:left="6480" w:hanging="360"/>
+      </w:pPr>
+      <w:rPr>
+        <w:rFonts w:ascii="Symbol" w:hAnsi="Symbol" w:hint="default"/>
+        <w:sz w:val="20"/>
+      </w:rPr>
+    </w:lvl>
+  </w:abstractNum>
+  <w:abstractNum w:abstractNumId="12" w15:restartNumberingAfterBreak="0">
+    <w:nsid w:val="5FF91C59"/>
+    <w:multiLevelType w:val="multilevel"/>
+    <w:tmpl w:val="4D645C70"/>
+    <w:lvl w:ilvl="0">
+      <w:start w:val="1"/>
+      <w:numFmt w:val="bullet"/>
+      <w:lvlText w:val=""/>
+      <w:lvlJc w:val="left"/>
+      <w:pPr>
+        <w:tabs>
+          <w:tab w:val="num" w:pos="720"/>
+        </w:tabs>
+        <w:ind w:left="720" w:hanging="360"/>
+      </w:pPr>
+      <w:rPr>
+        <w:rFonts w:ascii="Symbol" w:hAnsi="Symbol" w:hint="default"/>
+        <w:sz w:val="20"/>
+      </w:rPr>
+    </w:lvl>
+    <w:lvl w:ilvl="1" w:tentative="1">
+      <w:start w:val="1"/>
+      <w:numFmt w:val="bullet"/>
+      <w:lvlText w:val=""/>
+      <w:lvlJc w:val="left"/>
+      <w:pPr>
+        <w:tabs>
+          <w:tab w:val="num" w:pos="1440"/>
+        </w:tabs>
+        <w:ind w:left="1440" w:hanging="360"/>
+      </w:pPr>
+      <w:rPr>
+        <w:rFonts w:ascii="Symbol" w:hAnsi="Symbol" w:hint="default"/>
+        <w:sz w:val="20"/>
+      </w:rPr>
+    </w:lvl>
+    <w:lvl w:ilvl="2" w:tentative="1">
+      <w:start w:val="1"/>
+      <w:numFmt w:val="bullet"/>
+      <w:lvlText w:val=""/>
+      <w:lvlJc w:val="left"/>
+      <w:pPr>
+        <w:tabs>
+          <w:tab w:val="num" w:pos="2160"/>
+        </w:tabs>
+        <w:ind w:left="2160" w:hanging="360"/>
+      </w:pPr>
+      <w:rPr>
+        <w:rFonts w:ascii="Symbol" w:hAnsi="Symbol" w:hint="default"/>
+        <w:sz w:val="20"/>
+      </w:rPr>
+    </w:lvl>
+    <w:lvl w:ilvl="3" w:tentative="1">
+      <w:start w:val="1"/>
+      <w:numFmt w:val="bullet"/>
+      <w:lvlText w:val=""/>
+      <w:lvlJc w:val="left"/>
+      <w:pPr>
+        <w:tabs>
+          <w:tab w:val="num" w:pos="2880"/>
+        </w:tabs>
+        <w:ind w:left="2880" w:hanging="360"/>
+      </w:pPr>
+      <w:rPr>
+        <w:rFonts w:ascii="Symbol" w:hAnsi="Symbol" w:hint="default"/>
+        <w:sz w:val="20"/>
+      </w:rPr>
+    </w:lvl>
+    <w:lvl w:ilvl="4" w:tentative="1">
+      <w:start w:val="1"/>
+      <w:numFmt w:val="bullet"/>
+      <w:lvlText w:val=""/>
+      <w:lvlJc w:val="left"/>
+      <w:pPr>
+        <w:tabs>
+          <w:tab w:val="num" w:pos="3600"/>
+        </w:tabs>
+        <w:ind w:left="3600" w:hanging="360"/>
+      </w:pPr>
+      <w:rPr>
+        <w:rFonts w:ascii="Symbol" w:hAnsi="Symbol" w:hint="default"/>
+        <w:sz w:val="20"/>
+      </w:rPr>
+    </w:lvl>
+    <w:lvl w:ilvl="5" w:tentative="1">
+      <w:start w:val="1"/>
+      <w:numFmt w:val="bullet"/>
+      <w:lvlText w:val=""/>
+      <w:lvlJc w:val="left"/>
+      <w:pPr>
+        <w:tabs>
+          <w:tab w:val="num" w:pos="4320"/>
+        </w:tabs>
+        <w:ind w:left="4320" w:hanging="360"/>
+      </w:pPr>
+      <w:rPr>
+        <w:rFonts w:ascii="Symbol" w:hAnsi="Symbol" w:hint="default"/>
+        <w:sz w:val="20"/>
+      </w:rPr>
+    </w:lvl>
+    <w:lvl w:ilvl="6" w:tentative="1">
+      <w:start w:val="1"/>
+      <w:numFmt w:val="bullet"/>
+      <w:lvlText w:val=""/>
+      <w:lvlJc w:val="left"/>
+      <w:pPr>
+        <w:tabs>
+          <w:tab w:val="num" w:pos="5040"/>
+        </w:tabs>
+        <w:ind w:left="5040" w:hanging="360"/>
+      </w:pPr>
+      <w:rPr>
+        <w:rFonts w:ascii="Symbol" w:hAnsi="Symbol" w:hint="default"/>
+        <w:sz w:val="20"/>
+      </w:rPr>
+    </w:lvl>
+    <w:lvl w:ilvl="7" w:tentative="1">
+      <w:start w:val="1"/>
+      <w:numFmt w:val="bullet"/>
+      <w:lvlText w:val=""/>
+      <w:lvlJc w:val="left"/>
+      <w:pPr>
+        <w:tabs>
+          <w:tab w:val="num" w:pos="5760"/>
+        </w:tabs>
+        <w:ind w:left="5760" w:hanging="360"/>
+      </w:pPr>
+      <w:rPr>
+        <w:rFonts w:ascii="Symbol" w:hAnsi="Symbol" w:hint="default"/>
+        <w:sz w:val="20"/>
+      </w:rPr>
+    </w:lvl>
+    <w:lvl w:ilvl="8" w:tentative="1">
+      <w:start w:val="1"/>
+      <w:numFmt w:val="bullet"/>
+      <w:lvlText w:val=""/>
+      <w:lvlJc w:val="left"/>
+      <w:pPr>
+        <w:tabs>
+          <w:tab w:val="num" w:pos="6480"/>
+        </w:tabs>
+        <w:ind w:left="6480" w:hanging="360"/>
+      </w:pPr>
+      <w:rPr>
+        <w:rFonts w:ascii="Symbol" w:hAnsi="Symbol" w:hint="default"/>
+        <w:sz w:val="20"/>
+      </w:rPr>
+    </w:lvl>
+  </w:abstractNum>
+  <w:abstractNum w:abstractNumId="13" w15:restartNumberingAfterBreak="0">
+    <w:nsid w:val="6C1E1426"/>
+    <w:multiLevelType w:val="multilevel"/>
+    <w:tmpl w:val="338016E2"/>
+    <w:lvl w:ilvl="0">
+      <w:start w:val="1"/>
+      <w:numFmt w:val="bullet"/>
+      <w:lvlText w:val=""/>
+      <w:lvlJc w:val="left"/>
+      <w:pPr>
+        <w:tabs>
+          <w:tab w:val="num" w:pos="720"/>
+        </w:tabs>
+        <w:ind w:left="720" w:hanging="360"/>
+      </w:pPr>
+      <w:rPr>
+        <w:rFonts w:ascii="Symbol" w:hAnsi="Symbol" w:hint="default"/>
+        <w:sz w:val="20"/>
+      </w:rPr>
+    </w:lvl>
+    <w:lvl w:ilvl="1" w:tentative="1">
+      <w:start w:val="1"/>
+      <w:numFmt w:val="bullet"/>
+      <w:lvlText w:val=""/>
+      <w:lvlJc w:val="left"/>
+      <w:pPr>
+        <w:tabs>
+          <w:tab w:val="num" w:pos="1440"/>
+        </w:tabs>
+        <w:ind w:left="1440" w:hanging="360"/>
+      </w:pPr>
+      <w:rPr>
+        <w:rFonts w:ascii="Symbol" w:hAnsi="Symbol" w:hint="default"/>
+        <w:sz w:val="20"/>
+      </w:rPr>
+    </w:lvl>
+    <w:lvl w:ilvl="2" w:tentative="1">
+      <w:start w:val="1"/>
+      <w:numFmt w:val="bullet"/>
+      <w:lvlText w:val=""/>
+      <w:lvlJc w:val="left"/>
+      <w:pPr>
+        <w:tabs>
+          <w:tab w:val="num" w:pos="2160"/>
+        </w:tabs>
+        <w:ind w:left="2160" w:hanging="360"/>
+      </w:pPr>
+      <w:rPr>
+        <w:rFonts w:ascii="Symbol" w:hAnsi="Symbol" w:hint="default"/>
+        <w:sz w:val="20"/>
+      </w:rPr>
+    </w:lvl>
+    <w:lvl w:ilvl="3" w:tentative="1">
+      <w:start w:val="1"/>
+      <w:numFmt w:val="bullet"/>
+      <w:lvlText w:val=""/>
+      <w:lvlJc w:val="left"/>
+      <w:pPr>
+        <w:tabs>
+          <w:tab w:val="num" w:pos="2880"/>
+        </w:tabs>
+        <w:ind w:left="2880" w:hanging="360"/>
+      </w:pPr>
+      <w:rPr>
+        <w:rFonts w:ascii="Symbol" w:hAnsi="Symbol" w:hint="default"/>
+        <w:sz w:val="20"/>
+      </w:rPr>
+    </w:lvl>
+    <w:lvl w:ilvl="4" w:tentative="1">
+      <w:start w:val="1"/>
+      <w:numFmt w:val="bullet"/>
+      <w:lvlText w:val=""/>
+      <w:lvlJc w:val="left"/>
+      <w:pPr>
+        <w:tabs>
+          <w:tab w:val="num" w:pos="3600"/>
+        </w:tabs>
+        <w:ind w:left="3600" w:hanging="360"/>
+      </w:pPr>
+      <w:rPr>
+        <w:rFonts w:ascii="Symbol" w:hAnsi="Symbol" w:hint="default"/>
+        <w:sz w:val="20"/>
+      </w:rPr>
+    </w:lvl>
+    <w:lvl w:ilvl="5" w:tentative="1">
+      <w:start w:val="1"/>
+      <w:numFmt w:val="bullet"/>
+      <w:lvlText w:val=""/>
+      <w:lvlJc w:val="left"/>
+      <w:pPr>
+        <w:tabs>
+          <w:tab w:val="num" w:pos="4320"/>
+        </w:tabs>
+        <w:ind w:left="4320" w:hanging="360"/>
+      </w:pPr>
+      <w:rPr>
+        <w:rFonts w:ascii="Symbol" w:hAnsi="Symbol" w:hint="default"/>
+        <w:sz w:val="20"/>
+      </w:rPr>
+    </w:lvl>
+    <w:lvl w:ilvl="6" w:tentative="1">
+      <w:start w:val="1"/>
+      <w:numFmt w:val="bullet"/>
+      <w:lvlText w:val=""/>
+      <w:lvlJc w:val="left"/>
+      <w:pPr>
+        <w:tabs>
+          <w:tab w:val="num" w:pos="5040"/>
+        </w:tabs>
+        <w:ind w:left="5040" w:hanging="360"/>
+      </w:pPr>
+      <w:rPr>
+        <w:rFonts w:ascii="Symbol" w:hAnsi="Symbol" w:hint="default"/>
+        <w:sz w:val="20"/>
+      </w:rPr>
+    </w:lvl>
+    <w:lvl w:ilvl="7" w:tentative="1">
+      <w:start w:val="1"/>
+      <w:numFmt w:val="bullet"/>
+      <w:lvlText w:val=""/>
+      <w:lvlJc w:val="left"/>
+      <w:pPr>
+        <w:tabs>
+          <w:tab w:val="num" w:pos="5760"/>
+        </w:tabs>
+        <w:ind w:left="5760" w:hanging="360"/>
+      </w:pPr>
+      <w:rPr>
+        <w:rFonts w:ascii="Symbol" w:hAnsi="Symbol" w:hint="default"/>
+        <w:sz w:val="20"/>
+      </w:rPr>
+    </w:lvl>
+    <w:lvl w:ilvl="8" w:tentative="1">
+      <w:start w:val="1"/>
+      <w:numFmt w:val="bullet"/>
+      <w:lvlText w:val=""/>
+      <w:lvlJc w:val="left"/>
+      <w:pPr>
+        <w:tabs>
+          <w:tab w:val="num" w:pos="6480"/>
+        </w:tabs>
+        <w:ind w:left="6480" w:hanging="360"/>
+      </w:pPr>
+      <w:rPr>
+        <w:rFonts w:ascii="Symbol" w:hAnsi="Symbol" w:hint="default"/>
+        <w:sz w:val="20"/>
       </w:rPr>
     </w:lvl>
   </w:abstractNum>
@@ -1306,6 +3439,21 @@
   </w:num>
   <w:num w:numId="9" w16cid:durableId="1282222950">
     <w:abstractNumId w:val="0"/>
+  </w:num>
+  <w:num w:numId="10" w16cid:durableId="1129124309">
+    <w:abstractNumId w:val="12"/>
+  </w:num>
+  <w:num w:numId="11" w16cid:durableId="369839521">
+    <w:abstractNumId w:val="9"/>
+  </w:num>
+  <w:num w:numId="12" w16cid:durableId="827017321">
+    <w:abstractNumId w:val="13"/>
+  </w:num>
+  <w:num w:numId="13" w16cid:durableId="1755513347">
+    <w:abstractNumId w:val="10"/>
+  </w:num>
+  <w:num w:numId="14" w16cid:durableId="452333388">
+    <w:abstractNumId w:val="11"/>
   </w:num>
 </w:numbering>
 </file>
@@ -1917,7 +4065,6 @@
   <w:style w:type="character" w:default="1" w:styleId="Fuentedeprrafopredeter">
     <w:name w:val="Default Paragraph Font"/>
     <w:uiPriority w:val="1"/>
-    <w:semiHidden/>
     <w:unhideWhenUsed/>
   </w:style>
   <w:style w:type="table" w:default="1" w:styleId="Tablanormal">
@@ -12691,6 +14838,221 @@
       <w:tblPr/>
       <w:tcPr>
         <w:shd w:val="clear" w:color="auto" w:fill="FBCAA2" w:themeFill="accent6" w:themeFillTint="7F"/>
+      </w:tcPr>
+    </w:tblStylePr>
+  </w:style>
+  <w:style w:type="table" w:styleId="Tablaconcuadrculaclara">
+    <w:name w:val="Grid Table Light"/>
+    <w:basedOn w:val="Tablanormal"/>
+    <w:uiPriority w:val="99"/>
+    <w:rsid w:val="00A20B5F"/>
+    <w:pPr>
+      <w:spacing w:after="0" w:line="240" w:lineRule="auto"/>
+    </w:pPr>
+    <w:tblPr>
+      <w:tblBorders>
+        <w:top w:val="single" w:sz="4" w:space="0" w:color="BFBFBF" w:themeColor="background1" w:themeShade="BF"/>
+        <w:left w:val="single" w:sz="4" w:space="0" w:color="BFBFBF" w:themeColor="background1" w:themeShade="BF"/>
+        <w:bottom w:val="single" w:sz="4" w:space="0" w:color="BFBFBF" w:themeColor="background1" w:themeShade="BF"/>
+        <w:right w:val="single" w:sz="4" w:space="0" w:color="BFBFBF" w:themeColor="background1" w:themeShade="BF"/>
+        <w:insideH w:val="single" w:sz="4" w:space="0" w:color="BFBFBF" w:themeColor="background1" w:themeShade="BF"/>
+        <w:insideV w:val="single" w:sz="4" w:space="0" w:color="BFBFBF" w:themeColor="background1" w:themeShade="BF"/>
+      </w:tblBorders>
+    </w:tblPr>
+  </w:style>
+  <w:style w:type="table" w:styleId="Tablaconcuadrcula6concolores">
+    <w:name w:val="Grid Table 6 Colorful"/>
+    <w:basedOn w:val="Tablanormal"/>
+    <w:uiPriority w:val="51"/>
+    <w:rsid w:val="00A20B5F"/>
+    <w:pPr>
+      <w:spacing w:after="0" w:line="240" w:lineRule="auto"/>
+    </w:pPr>
+    <w:rPr>
+      <w:color w:val="000000" w:themeColor="text1"/>
+    </w:rPr>
+    <w:tblPr>
+      <w:tblStyleRowBandSize w:val="1"/>
+      <w:tblStyleColBandSize w:val="1"/>
+      <w:tblBorders>
+        <w:top w:val="single" w:sz="4" w:space="0" w:color="666666" w:themeColor="text1" w:themeTint="99"/>
+        <w:left w:val="single" w:sz="4" w:space="0" w:color="666666" w:themeColor="text1" w:themeTint="99"/>
+        <w:bottom w:val="single" w:sz="4" w:space="0" w:color="666666" w:themeColor="text1" w:themeTint="99"/>
+        <w:right w:val="single" w:sz="4" w:space="0" w:color="666666" w:themeColor="text1" w:themeTint="99"/>
+        <w:insideH w:val="single" w:sz="4" w:space="0" w:color="666666" w:themeColor="text1" w:themeTint="99"/>
+        <w:insideV w:val="single" w:sz="4" w:space="0" w:color="666666" w:themeColor="text1" w:themeTint="99"/>
+      </w:tblBorders>
+    </w:tblPr>
+    <w:tblStylePr w:type="firstRow">
+      <w:rPr>
+        <w:b/>
+        <w:bCs/>
+      </w:rPr>
+      <w:tblPr/>
+      <w:tcPr>
+        <w:tcBorders>
+          <w:bottom w:val="single" w:sz="12" w:space="0" w:color="666666" w:themeColor="text1" w:themeTint="99"/>
+        </w:tcBorders>
+      </w:tcPr>
+    </w:tblStylePr>
+    <w:tblStylePr w:type="lastRow">
+      <w:rPr>
+        <w:b/>
+        <w:bCs/>
+      </w:rPr>
+      <w:tblPr/>
+      <w:tcPr>
+        <w:tcBorders>
+          <w:top w:val="double" w:sz="4" w:space="0" w:color="666666" w:themeColor="text1" w:themeTint="99"/>
+        </w:tcBorders>
+      </w:tcPr>
+    </w:tblStylePr>
+    <w:tblStylePr w:type="firstCol">
+      <w:rPr>
+        <w:b/>
+        <w:bCs/>
+      </w:rPr>
+    </w:tblStylePr>
+    <w:tblStylePr w:type="lastCol">
+      <w:rPr>
+        <w:b/>
+        <w:bCs/>
+      </w:rPr>
+    </w:tblStylePr>
+    <w:tblStylePr w:type="band1Vert">
+      <w:tblPr/>
+      <w:tcPr>
+        <w:shd w:val="clear" w:color="auto" w:fill="CCCCCC" w:themeFill="text1" w:themeFillTint="33"/>
+      </w:tcPr>
+    </w:tblStylePr>
+    <w:tblStylePr w:type="band1Horz">
+      <w:tblPr/>
+      <w:tcPr>
+        <w:shd w:val="clear" w:color="auto" w:fill="CCCCCC" w:themeFill="text1" w:themeFillTint="33"/>
+      </w:tcPr>
+    </w:tblStylePr>
+  </w:style>
+  <w:style w:type="table" w:styleId="Tabladelista3">
+    <w:name w:val="List Table 3"/>
+    <w:basedOn w:val="Tablanormal"/>
+    <w:uiPriority w:val="48"/>
+    <w:rsid w:val="00A20B5F"/>
+    <w:pPr>
+      <w:spacing w:after="0" w:line="240" w:lineRule="auto"/>
+    </w:pPr>
+    <w:tblPr>
+      <w:tblStyleRowBandSize w:val="1"/>
+      <w:tblStyleColBandSize w:val="1"/>
+      <w:tblBorders>
+        <w:top w:val="single" w:sz="4" w:space="0" w:color="000000" w:themeColor="text1"/>
+        <w:left w:val="single" w:sz="4" w:space="0" w:color="000000" w:themeColor="text1"/>
+        <w:bottom w:val="single" w:sz="4" w:space="0" w:color="000000" w:themeColor="text1"/>
+        <w:right w:val="single" w:sz="4" w:space="0" w:color="000000" w:themeColor="text1"/>
+      </w:tblBorders>
+    </w:tblPr>
+    <w:tblStylePr w:type="firstRow">
+      <w:rPr>
+        <w:b/>
+        <w:bCs/>
+        <w:color w:val="FFFFFF" w:themeColor="background1"/>
+      </w:rPr>
+      <w:tblPr/>
+      <w:tcPr>
+        <w:shd w:val="clear" w:color="auto" w:fill="000000" w:themeFill="text1"/>
+      </w:tcPr>
+    </w:tblStylePr>
+    <w:tblStylePr w:type="lastRow">
+      <w:rPr>
+        <w:b/>
+        <w:bCs/>
+      </w:rPr>
+      <w:tblPr/>
+      <w:tcPr>
+        <w:tcBorders>
+          <w:top w:val="double" w:sz="4" w:space="0" w:color="000000" w:themeColor="text1"/>
+        </w:tcBorders>
+        <w:shd w:val="clear" w:color="auto" w:fill="FFFFFF" w:themeFill="background1"/>
+      </w:tcPr>
+    </w:tblStylePr>
+    <w:tblStylePr w:type="firstCol">
+      <w:rPr>
+        <w:b/>
+        <w:bCs/>
+      </w:rPr>
+      <w:tblPr/>
+      <w:tcPr>
+        <w:tcBorders>
+          <w:right w:val="nil"/>
+        </w:tcBorders>
+        <w:shd w:val="clear" w:color="auto" w:fill="FFFFFF" w:themeFill="background1"/>
+      </w:tcPr>
+    </w:tblStylePr>
+    <w:tblStylePr w:type="lastCol">
+      <w:rPr>
+        <w:b/>
+        <w:bCs/>
+      </w:rPr>
+      <w:tblPr/>
+      <w:tcPr>
+        <w:tcBorders>
+          <w:left w:val="nil"/>
+        </w:tcBorders>
+        <w:shd w:val="clear" w:color="auto" w:fill="FFFFFF" w:themeFill="background1"/>
+      </w:tcPr>
+    </w:tblStylePr>
+    <w:tblStylePr w:type="band1Vert">
+      <w:tblPr/>
+      <w:tcPr>
+        <w:tcBorders>
+          <w:left w:val="single" w:sz="4" w:space="0" w:color="000000" w:themeColor="text1"/>
+          <w:right w:val="single" w:sz="4" w:space="0" w:color="000000" w:themeColor="text1"/>
+        </w:tcBorders>
+      </w:tcPr>
+    </w:tblStylePr>
+    <w:tblStylePr w:type="band1Horz">
+      <w:tblPr/>
+      <w:tcPr>
+        <w:tcBorders>
+          <w:top w:val="single" w:sz="4" w:space="0" w:color="000000" w:themeColor="text1"/>
+          <w:bottom w:val="single" w:sz="4" w:space="0" w:color="000000" w:themeColor="text1"/>
+          <w:insideH w:val="nil"/>
+        </w:tcBorders>
+      </w:tcPr>
+    </w:tblStylePr>
+    <w:tblStylePr w:type="neCell">
+      <w:tblPr/>
+      <w:tcPr>
+        <w:tcBorders>
+          <w:left w:val="nil"/>
+          <w:bottom w:val="nil"/>
+        </w:tcBorders>
+      </w:tcPr>
+    </w:tblStylePr>
+    <w:tblStylePr w:type="nwCell">
+      <w:tblPr/>
+      <w:tcPr>
+        <w:tcBorders>
+          <w:bottom w:val="nil"/>
+          <w:right w:val="nil"/>
+        </w:tcBorders>
+      </w:tcPr>
+    </w:tblStylePr>
+    <w:tblStylePr w:type="seCell">
+      <w:tblPr/>
+      <w:tcPr>
+        <w:tcBorders>
+          <w:top w:val="double" w:sz="4" w:space="0" w:color="000000" w:themeColor="text1"/>
+          <w:left w:val="nil"/>
+        </w:tcBorders>
+      </w:tcPr>
+    </w:tblStylePr>
+    <w:tblStylePr w:type="swCell">
+      <w:tblPr/>
+      <w:tcPr>
+        <w:tcBorders>
+          <w:top w:val="double" w:sz="4" w:space="0" w:color="000000" w:themeColor="text1"/>
+          <w:right w:val="nil"/>
+        </w:tcBorders>
       </w:tcPr>
     </w:tblStylePr>
   </w:style>

</xml_diff>